<commit_message>
cleaning + update conference
</commit_message>
<xml_diff>
--- a/CONFERENCE/Physics 2026/МАТЕМАТИЧНЕ МОДЕЛЮВАННЯ ДИНАМІКИ СИСТЕМ ТИПУ МАШИНИ АТВУДА В ІГРОВИХ РУШІЯХ ДЛЯ СТРАТЕГІЧНИХ ІГОР.docx
+++ b/CONFERENCE/Physics 2026/МАТЕМАТИЧНЕ МОДЕЛЮВАННЯ ДИНАМІКИ СИСТЕМ ТИПУ МАШИНИ АТВУДА В ІГРОВИХ РУШІЯХ ДЛЯ СТРАТЕГІЧНИХ ІГОР.docx
@@ -29,6 +29,7 @@
           <w:rFonts w:ascii="Times New Roman" w:eastAsia="Times New Roman" w:hAnsi="Times New Roman" w:cs="Times New Roman"/>
           <w:b/>
           <w:sz w:val="28"/>
+          <w:lang w:val="en-US"/>
         </w:rPr>
       </w:pPr>
       <w:r>
@@ -37,7 +38,7 @@
           <w:b/>
           <w:sz w:val="28"/>
         </w:rPr>
-        <w:t>Коваль О. Д.</w:t>
+        <w:t>О. Д. Коваль</w:t>
       </w:r>
     </w:p>
     <w:p>
@@ -57,7 +58,7 @@
           <w:b/>
           <w:sz w:val="28"/>
         </w:rPr>
-        <w:t>Мартинюк В.В.</w:t>
+        <w:t>В. В. Мартинюк</w:t>
       </w:r>
     </w:p>
     <w:p>
@@ -146,7 +147,7 @@
           <w:i/>
           <w:sz w:val="20"/>
         </w:rPr>
-        <w:t xml:space="preserve">У роботі досліджено особливості інтеграції класичної фізичної моделі машини </w:t>
+        <w:t xml:space="preserve">У роботі досліджено особливості інтеграції та математичного моделювання класичної фізичної моделі машини </w:t>
       </w:r>
       <w:proofErr w:type="spellStart"/>
       <w:r>
@@ -164,7 +165,97 @@
           <w:i/>
           <w:sz w:val="20"/>
         </w:rPr>
-        <w:t xml:space="preserve"> в сучасні ігрові рушії для підвищення реалізму механічних взаємодій у стратегічних іграх. Проведено аналіз математичного апарату динаміки зв’язаних систем та виявлено специфічні проблеми, що виникають при дискретизації часу в ігрових симуляціях. Особливу увагу приділено методам компенсації чисельних похибок та оптимізації розрахунків для підтримки високої продуктивності при моделюванні масових сцен. Результати дослідження можуть бути використані для розробки систем облогових знарядь, підйомних механізмів та інтерактивного оточення в </w:t>
+        <w:t xml:space="preserve"> в сучасних ігрових рушіях для підвищення реалізму механічних взаємодій у стратегічних іграх. Проведено аналіз математичного апарату динаміки зв’язаних систем, доповнений розрахунком сил натягу, рівнянь </w:t>
+      </w:r>
+      <w:proofErr w:type="spellStart"/>
+      <w:r>
+        <w:rPr>
+          <w:rFonts w:ascii="Times New Roman" w:eastAsia="Times New Roman" w:hAnsi="Times New Roman" w:cs="Times New Roman"/>
+          <w:i/>
+          <w:sz w:val="20"/>
+        </w:rPr>
+        <w:t>голономних</w:t>
+      </w:r>
+      <w:proofErr w:type="spellEnd"/>
+      <w:r>
+        <w:rPr>
+          <w:rFonts w:ascii="Times New Roman" w:eastAsia="Times New Roman" w:hAnsi="Times New Roman" w:cs="Times New Roman"/>
+          <w:i/>
+          <w:sz w:val="20"/>
+        </w:rPr>
+        <w:t xml:space="preserve"> </w:t>
+      </w:r>
+      <w:proofErr w:type="spellStart"/>
+      <w:r>
+        <w:rPr>
+          <w:rFonts w:ascii="Times New Roman" w:eastAsia="Times New Roman" w:hAnsi="Times New Roman" w:cs="Times New Roman"/>
+          <w:i/>
+          <w:sz w:val="20"/>
+        </w:rPr>
+        <w:t>зв'язків</w:t>
+      </w:r>
+      <w:proofErr w:type="spellEnd"/>
+      <w:r>
+        <w:rPr>
+          <w:rFonts w:ascii="Times New Roman" w:eastAsia="Times New Roman" w:hAnsi="Times New Roman" w:cs="Times New Roman"/>
+          <w:i/>
+          <w:sz w:val="20"/>
+        </w:rPr>
+        <w:t xml:space="preserve"> та функцій демпфування. Виявлено специфічні проблеми, що виникають при дискретизації часу в ігрових симуляціях. Особливу увагу приділено методам компенсації чисельних похибок за допомогою інтегрування </w:t>
+      </w:r>
+      <w:proofErr w:type="spellStart"/>
+      <w:r>
+        <w:rPr>
+          <w:rFonts w:ascii="Times New Roman" w:eastAsia="Times New Roman" w:hAnsi="Times New Roman" w:cs="Times New Roman"/>
+          <w:i/>
+          <w:sz w:val="20"/>
+        </w:rPr>
+        <w:t>Верле</w:t>
+      </w:r>
+      <w:proofErr w:type="spellEnd"/>
+      <w:r>
+        <w:rPr>
+          <w:rFonts w:ascii="Times New Roman" w:eastAsia="Times New Roman" w:hAnsi="Times New Roman" w:cs="Times New Roman"/>
+          <w:i/>
+          <w:sz w:val="20"/>
+        </w:rPr>
+        <w:t xml:space="preserve"> та оптимізації розрахунків (</w:t>
+      </w:r>
+      <w:proofErr w:type="spellStart"/>
+      <w:r>
+        <w:rPr>
+          <w:rFonts w:ascii="Times New Roman" w:eastAsia="Times New Roman" w:hAnsi="Times New Roman" w:cs="Times New Roman"/>
+          <w:i/>
+          <w:sz w:val="20"/>
+        </w:rPr>
+        <w:t>Constraint</w:t>
+      </w:r>
+      <w:proofErr w:type="spellEnd"/>
+      <w:r>
+        <w:rPr>
+          <w:rFonts w:ascii="Times New Roman" w:eastAsia="Times New Roman" w:hAnsi="Times New Roman" w:cs="Times New Roman"/>
+          <w:i/>
+          <w:sz w:val="20"/>
+        </w:rPr>
+        <w:t xml:space="preserve"> </w:t>
+      </w:r>
+      <w:proofErr w:type="spellStart"/>
+      <w:r>
+        <w:rPr>
+          <w:rFonts w:ascii="Times New Roman" w:eastAsia="Times New Roman" w:hAnsi="Times New Roman" w:cs="Times New Roman"/>
+          <w:i/>
+          <w:sz w:val="20"/>
+        </w:rPr>
+        <w:t>Solvers</w:t>
+      </w:r>
+      <w:proofErr w:type="spellEnd"/>
+      <w:r>
+        <w:rPr>
+          <w:rFonts w:ascii="Times New Roman" w:eastAsia="Times New Roman" w:hAnsi="Times New Roman" w:cs="Times New Roman"/>
+          <w:i/>
+          <w:sz w:val="20"/>
+        </w:rPr>
+        <w:t xml:space="preserve">) для підтримки високої продуктивності при моделюванні масових сцен. Результати дослідження можуть бути використані для розробки систем облогових знарядь, підйомних механізмів та інтерактивного оточення в </w:t>
       </w:r>
       <w:proofErr w:type="spellStart"/>
       <w:r>
@@ -246,7 +337,23 @@
           <w:rFonts w:ascii="Times New Roman" w:eastAsia="Times New Roman" w:hAnsi="Times New Roman" w:cs="Times New Roman"/>
           <w:sz w:val="20"/>
         </w:rPr>
-        <w:t>, математичне моделювання, ігрові рушії, динаміка, чисельне інтегрування</w:t>
+        <w:t xml:space="preserve">, математичне моделювання, рівняння </w:t>
+      </w:r>
+      <w:proofErr w:type="spellStart"/>
+      <w:r>
+        <w:rPr>
+          <w:rFonts w:ascii="Times New Roman" w:eastAsia="Times New Roman" w:hAnsi="Times New Roman" w:cs="Times New Roman"/>
+          <w:sz w:val="20"/>
+        </w:rPr>
+        <w:t>зв'язків</w:t>
+      </w:r>
+      <w:proofErr w:type="spellEnd"/>
+      <w:r>
+        <w:rPr>
+          <w:rFonts w:ascii="Times New Roman" w:eastAsia="Times New Roman" w:hAnsi="Times New Roman" w:cs="Times New Roman"/>
+          <w:sz w:val="20"/>
+        </w:rPr>
+        <w:t>, демпфування, ігрові рушії, динаміка, чисельне інтегрування</w:t>
       </w:r>
       <w:r>
         <w:rPr>
@@ -417,6 +524,60 @@
           <w:i/>
           <w:sz w:val="20"/>
         </w:rPr>
+        <w:t>and</w:t>
+      </w:r>
+      <w:proofErr w:type="spellEnd"/>
+      <w:r>
+        <w:rPr>
+          <w:rFonts w:ascii="Times New Roman" w:eastAsia="Times New Roman" w:hAnsi="Times New Roman" w:cs="Times New Roman"/>
+          <w:i/>
+          <w:sz w:val="20"/>
+        </w:rPr>
+        <w:t xml:space="preserve"> </w:t>
+      </w:r>
+      <w:proofErr w:type="spellStart"/>
+      <w:r>
+        <w:rPr>
+          <w:rFonts w:ascii="Times New Roman" w:eastAsia="Times New Roman" w:hAnsi="Times New Roman" w:cs="Times New Roman"/>
+          <w:i/>
+          <w:sz w:val="20"/>
+        </w:rPr>
+        <w:t>mathematically</w:t>
+      </w:r>
+      <w:proofErr w:type="spellEnd"/>
+      <w:r>
+        <w:rPr>
+          <w:rFonts w:ascii="Times New Roman" w:eastAsia="Times New Roman" w:hAnsi="Times New Roman" w:cs="Times New Roman"/>
+          <w:i/>
+          <w:sz w:val="20"/>
+        </w:rPr>
+        <w:t xml:space="preserve"> </w:t>
+      </w:r>
+      <w:proofErr w:type="spellStart"/>
+      <w:r>
+        <w:rPr>
+          <w:rFonts w:ascii="Times New Roman" w:eastAsia="Times New Roman" w:hAnsi="Times New Roman" w:cs="Times New Roman"/>
+          <w:i/>
+          <w:sz w:val="20"/>
+        </w:rPr>
+        <w:t>modeling</w:t>
+      </w:r>
+      <w:proofErr w:type="spellEnd"/>
+      <w:r>
+        <w:rPr>
+          <w:rFonts w:ascii="Times New Roman" w:eastAsia="Times New Roman" w:hAnsi="Times New Roman" w:cs="Times New Roman"/>
+          <w:i/>
+          <w:sz w:val="20"/>
+        </w:rPr>
+        <w:t xml:space="preserve"> </w:t>
+      </w:r>
+      <w:proofErr w:type="spellStart"/>
+      <w:r>
+        <w:rPr>
+          <w:rFonts w:ascii="Times New Roman" w:eastAsia="Times New Roman" w:hAnsi="Times New Roman" w:cs="Times New Roman"/>
+          <w:i/>
+          <w:sz w:val="20"/>
+        </w:rPr>
         <w:t>the</w:t>
       </w:r>
       <w:proofErr w:type="spellEnd"/>
@@ -561,7 +722,7 @@
           <w:i/>
           <w:sz w:val="20"/>
         </w:rPr>
-        <w:t>into</w:t>
+        <w:t>in</w:t>
       </w:r>
       <w:proofErr w:type="spellEnd"/>
       <w:r>
@@ -1011,6 +1172,186 @@
           <w:i/>
           <w:sz w:val="20"/>
         </w:rPr>
+        <w:t>supplemented</w:t>
+      </w:r>
+      <w:proofErr w:type="spellEnd"/>
+      <w:r>
+        <w:rPr>
+          <w:rFonts w:ascii="Times New Roman" w:eastAsia="Times New Roman" w:hAnsi="Times New Roman" w:cs="Times New Roman"/>
+          <w:i/>
+          <w:sz w:val="20"/>
+        </w:rPr>
+        <w:t xml:space="preserve"> </w:t>
+      </w:r>
+      <w:proofErr w:type="spellStart"/>
+      <w:r>
+        <w:rPr>
+          <w:rFonts w:ascii="Times New Roman" w:eastAsia="Times New Roman" w:hAnsi="Times New Roman" w:cs="Times New Roman"/>
+          <w:i/>
+          <w:sz w:val="20"/>
+        </w:rPr>
+        <w:t>by</w:t>
+      </w:r>
+      <w:proofErr w:type="spellEnd"/>
+      <w:r>
+        <w:rPr>
+          <w:rFonts w:ascii="Times New Roman" w:eastAsia="Times New Roman" w:hAnsi="Times New Roman" w:cs="Times New Roman"/>
+          <w:i/>
+          <w:sz w:val="20"/>
+        </w:rPr>
+        <w:t xml:space="preserve"> </w:t>
+      </w:r>
+      <w:proofErr w:type="spellStart"/>
+      <w:r>
+        <w:rPr>
+          <w:rFonts w:ascii="Times New Roman" w:eastAsia="Times New Roman" w:hAnsi="Times New Roman" w:cs="Times New Roman"/>
+          <w:i/>
+          <w:sz w:val="20"/>
+        </w:rPr>
+        <w:t>the</w:t>
+      </w:r>
+      <w:proofErr w:type="spellEnd"/>
+      <w:r>
+        <w:rPr>
+          <w:rFonts w:ascii="Times New Roman" w:eastAsia="Times New Roman" w:hAnsi="Times New Roman" w:cs="Times New Roman"/>
+          <w:i/>
+          <w:sz w:val="20"/>
+        </w:rPr>
+        <w:t xml:space="preserve"> </w:t>
+      </w:r>
+      <w:proofErr w:type="spellStart"/>
+      <w:r>
+        <w:rPr>
+          <w:rFonts w:ascii="Times New Roman" w:eastAsia="Times New Roman" w:hAnsi="Times New Roman" w:cs="Times New Roman"/>
+          <w:i/>
+          <w:sz w:val="20"/>
+        </w:rPr>
+        <w:t>calculation</w:t>
+      </w:r>
+      <w:proofErr w:type="spellEnd"/>
+      <w:r>
+        <w:rPr>
+          <w:rFonts w:ascii="Times New Roman" w:eastAsia="Times New Roman" w:hAnsi="Times New Roman" w:cs="Times New Roman"/>
+          <w:i/>
+          <w:sz w:val="20"/>
+        </w:rPr>
+        <w:t xml:space="preserve"> </w:t>
+      </w:r>
+      <w:proofErr w:type="spellStart"/>
+      <w:r>
+        <w:rPr>
+          <w:rFonts w:ascii="Times New Roman" w:eastAsia="Times New Roman" w:hAnsi="Times New Roman" w:cs="Times New Roman"/>
+          <w:i/>
+          <w:sz w:val="20"/>
+        </w:rPr>
+        <w:t>of</w:t>
+      </w:r>
+      <w:proofErr w:type="spellEnd"/>
+      <w:r>
+        <w:rPr>
+          <w:rFonts w:ascii="Times New Roman" w:eastAsia="Times New Roman" w:hAnsi="Times New Roman" w:cs="Times New Roman"/>
+          <w:i/>
+          <w:sz w:val="20"/>
+        </w:rPr>
+        <w:t xml:space="preserve"> </w:t>
+      </w:r>
+      <w:proofErr w:type="spellStart"/>
+      <w:r>
+        <w:rPr>
+          <w:rFonts w:ascii="Times New Roman" w:eastAsia="Times New Roman" w:hAnsi="Times New Roman" w:cs="Times New Roman"/>
+          <w:i/>
+          <w:sz w:val="20"/>
+        </w:rPr>
+        <w:t>tension</w:t>
+      </w:r>
+      <w:proofErr w:type="spellEnd"/>
+      <w:r>
+        <w:rPr>
+          <w:rFonts w:ascii="Times New Roman" w:eastAsia="Times New Roman" w:hAnsi="Times New Roman" w:cs="Times New Roman"/>
+          <w:i/>
+          <w:sz w:val="20"/>
+        </w:rPr>
+        <w:t xml:space="preserve"> </w:t>
+      </w:r>
+      <w:proofErr w:type="spellStart"/>
+      <w:r>
+        <w:rPr>
+          <w:rFonts w:ascii="Times New Roman" w:eastAsia="Times New Roman" w:hAnsi="Times New Roman" w:cs="Times New Roman"/>
+          <w:i/>
+          <w:sz w:val="20"/>
+        </w:rPr>
+        <w:t>forces</w:t>
+      </w:r>
+      <w:proofErr w:type="spellEnd"/>
+      <w:r>
+        <w:rPr>
+          <w:rFonts w:ascii="Times New Roman" w:eastAsia="Times New Roman" w:hAnsi="Times New Roman" w:cs="Times New Roman"/>
+          <w:i/>
+          <w:sz w:val="20"/>
+        </w:rPr>
+        <w:t xml:space="preserve">, </w:t>
+      </w:r>
+      <w:proofErr w:type="spellStart"/>
+      <w:r>
+        <w:rPr>
+          <w:rFonts w:ascii="Times New Roman" w:eastAsia="Times New Roman" w:hAnsi="Times New Roman" w:cs="Times New Roman"/>
+          <w:i/>
+          <w:sz w:val="20"/>
+        </w:rPr>
+        <w:t>holonomic</w:t>
+      </w:r>
+      <w:proofErr w:type="spellEnd"/>
+      <w:r>
+        <w:rPr>
+          <w:rFonts w:ascii="Times New Roman" w:eastAsia="Times New Roman" w:hAnsi="Times New Roman" w:cs="Times New Roman"/>
+          <w:i/>
+          <w:sz w:val="20"/>
+        </w:rPr>
+        <w:t xml:space="preserve"> </w:t>
+      </w:r>
+      <w:proofErr w:type="spellStart"/>
+      <w:r>
+        <w:rPr>
+          <w:rFonts w:ascii="Times New Roman" w:eastAsia="Times New Roman" w:hAnsi="Times New Roman" w:cs="Times New Roman"/>
+          <w:i/>
+          <w:sz w:val="20"/>
+        </w:rPr>
+        <w:t>constraint</w:t>
+      </w:r>
+      <w:proofErr w:type="spellEnd"/>
+      <w:r>
+        <w:rPr>
+          <w:rFonts w:ascii="Times New Roman" w:eastAsia="Times New Roman" w:hAnsi="Times New Roman" w:cs="Times New Roman"/>
+          <w:i/>
+          <w:sz w:val="20"/>
+        </w:rPr>
+        <w:t xml:space="preserve"> </w:t>
+      </w:r>
+      <w:proofErr w:type="spellStart"/>
+      <w:r>
+        <w:rPr>
+          <w:rFonts w:ascii="Times New Roman" w:eastAsia="Times New Roman" w:hAnsi="Times New Roman" w:cs="Times New Roman"/>
+          <w:i/>
+          <w:sz w:val="20"/>
+        </w:rPr>
+        <w:t>equations</w:t>
+      </w:r>
+      <w:proofErr w:type="spellEnd"/>
+      <w:r>
+        <w:rPr>
+          <w:rFonts w:ascii="Times New Roman" w:eastAsia="Times New Roman" w:hAnsi="Times New Roman" w:cs="Times New Roman"/>
+          <w:i/>
+          <w:sz w:val="20"/>
+        </w:rPr>
+        <w:t xml:space="preserve">, </w:t>
+      </w:r>
+      <w:proofErr w:type="spellStart"/>
+      <w:r>
+        <w:rPr>
+          <w:rFonts w:ascii="Times New Roman" w:eastAsia="Times New Roman" w:hAnsi="Times New Roman" w:cs="Times New Roman"/>
+          <w:i/>
+          <w:sz w:val="20"/>
+        </w:rPr>
         <w:t>and</w:t>
       </w:r>
       <w:proofErr w:type="spellEnd"/>
@@ -1029,7 +1370,43 @@
           <w:i/>
           <w:sz w:val="20"/>
         </w:rPr>
-        <w:t>specific</w:t>
+        <w:t>damping</w:t>
+      </w:r>
+      <w:proofErr w:type="spellEnd"/>
+      <w:r>
+        <w:rPr>
+          <w:rFonts w:ascii="Times New Roman" w:eastAsia="Times New Roman" w:hAnsi="Times New Roman" w:cs="Times New Roman"/>
+          <w:i/>
+          <w:sz w:val="20"/>
+        </w:rPr>
+        <w:t xml:space="preserve"> </w:t>
+      </w:r>
+      <w:proofErr w:type="spellStart"/>
+      <w:r>
+        <w:rPr>
+          <w:rFonts w:ascii="Times New Roman" w:eastAsia="Times New Roman" w:hAnsi="Times New Roman" w:cs="Times New Roman"/>
+          <w:i/>
+          <w:sz w:val="20"/>
+        </w:rPr>
+        <w:t>functions</w:t>
+      </w:r>
+      <w:proofErr w:type="spellEnd"/>
+      <w:r>
+        <w:rPr>
+          <w:rFonts w:ascii="Times New Roman" w:eastAsia="Times New Roman" w:hAnsi="Times New Roman" w:cs="Times New Roman"/>
+          <w:i/>
+          <w:sz w:val="20"/>
+        </w:rPr>
+        <w:t xml:space="preserve">. </w:t>
+      </w:r>
+      <w:proofErr w:type="spellStart"/>
+      <w:r>
+        <w:rPr>
+          <w:rFonts w:ascii="Times New Roman" w:eastAsia="Times New Roman" w:hAnsi="Times New Roman" w:cs="Times New Roman"/>
+          <w:i/>
+          <w:sz w:val="20"/>
+        </w:rPr>
+        <w:t>Specific</w:t>
       </w:r>
       <w:proofErr w:type="spellEnd"/>
       <w:r>
@@ -1407,6 +1784,60 @@
           <w:i/>
           <w:sz w:val="20"/>
         </w:rPr>
+        <w:t>using</w:t>
+      </w:r>
+      <w:proofErr w:type="spellEnd"/>
+      <w:r>
+        <w:rPr>
+          <w:rFonts w:ascii="Times New Roman" w:eastAsia="Times New Roman" w:hAnsi="Times New Roman" w:cs="Times New Roman"/>
+          <w:i/>
+          <w:sz w:val="20"/>
+        </w:rPr>
+        <w:t xml:space="preserve"> </w:t>
+      </w:r>
+      <w:proofErr w:type="spellStart"/>
+      <w:r>
+        <w:rPr>
+          <w:rFonts w:ascii="Times New Roman" w:eastAsia="Times New Roman" w:hAnsi="Times New Roman" w:cs="Times New Roman"/>
+          <w:i/>
+          <w:sz w:val="20"/>
+        </w:rPr>
+        <w:t>Verlet</w:t>
+      </w:r>
+      <w:proofErr w:type="spellEnd"/>
+      <w:r>
+        <w:rPr>
+          <w:rFonts w:ascii="Times New Roman" w:eastAsia="Times New Roman" w:hAnsi="Times New Roman" w:cs="Times New Roman"/>
+          <w:i/>
+          <w:sz w:val="20"/>
+        </w:rPr>
+        <w:t xml:space="preserve"> </w:t>
+      </w:r>
+      <w:proofErr w:type="spellStart"/>
+      <w:r>
+        <w:rPr>
+          <w:rFonts w:ascii="Times New Roman" w:eastAsia="Times New Roman" w:hAnsi="Times New Roman" w:cs="Times New Roman"/>
+          <w:i/>
+          <w:sz w:val="20"/>
+        </w:rPr>
+        <w:t>integration</w:t>
+      </w:r>
+      <w:proofErr w:type="spellEnd"/>
+      <w:r>
+        <w:rPr>
+          <w:rFonts w:ascii="Times New Roman" w:eastAsia="Times New Roman" w:hAnsi="Times New Roman" w:cs="Times New Roman"/>
+          <w:i/>
+          <w:sz w:val="20"/>
+        </w:rPr>
+        <w:t xml:space="preserve"> </w:t>
+      </w:r>
+      <w:proofErr w:type="spellStart"/>
+      <w:r>
+        <w:rPr>
+          <w:rFonts w:ascii="Times New Roman" w:eastAsia="Times New Roman" w:hAnsi="Times New Roman" w:cs="Times New Roman"/>
+          <w:i/>
+          <w:sz w:val="20"/>
+        </w:rPr>
         <w:t>and</w:t>
       </w:r>
       <w:proofErr w:type="spellEnd"/>
@@ -1452,7 +1883,43 @@
           <w:i/>
           <w:sz w:val="20"/>
         </w:rPr>
-        <w:t xml:space="preserve"> </w:t>
+        <w:t xml:space="preserve"> (</w:t>
+      </w:r>
+      <w:proofErr w:type="spellStart"/>
+      <w:r>
+        <w:rPr>
+          <w:rFonts w:ascii="Times New Roman" w:eastAsia="Times New Roman" w:hAnsi="Times New Roman" w:cs="Times New Roman"/>
+          <w:i/>
+          <w:sz w:val="20"/>
+        </w:rPr>
+        <w:t>Constraint</w:t>
+      </w:r>
+      <w:proofErr w:type="spellEnd"/>
+      <w:r>
+        <w:rPr>
+          <w:rFonts w:ascii="Times New Roman" w:eastAsia="Times New Roman" w:hAnsi="Times New Roman" w:cs="Times New Roman"/>
+          <w:i/>
+          <w:sz w:val="20"/>
+        </w:rPr>
+        <w:t xml:space="preserve"> </w:t>
+      </w:r>
+      <w:proofErr w:type="spellStart"/>
+      <w:r>
+        <w:rPr>
+          <w:rFonts w:ascii="Times New Roman" w:eastAsia="Times New Roman" w:hAnsi="Times New Roman" w:cs="Times New Roman"/>
+          <w:i/>
+          <w:sz w:val="20"/>
+        </w:rPr>
+        <w:t>Solvers</w:t>
+      </w:r>
+      <w:proofErr w:type="spellEnd"/>
+      <w:r>
+        <w:rPr>
+          <w:rFonts w:ascii="Times New Roman" w:eastAsia="Times New Roman" w:hAnsi="Times New Roman" w:cs="Times New Roman"/>
+          <w:i/>
+          <w:sz w:val="20"/>
+        </w:rPr>
+        <w:t xml:space="preserve">) </w:t>
       </w:r>
       <w:proofErr w:type="spellStart"/>
       <w:r>
@@ -2052,6 +2519,54 @@
           <w:sz w:val="20"/>
         </w:rPr>
         <w:t>modeling</w:t>
+      </w:r>
+      <w:proofErr w:type="spellEnd"/>
+      <w:r>
+        <w:rPr>
+          <w:rFonts w:ascii="Times New Roman" w:eastAsia="Times New Roman" w:hAnsi="Times New Roman" w:cs="Times New Roman"/>
+          <w:sz w:val="20"/>
+        </w:rPr>
+        <w:t xml:space="preserve">, </w:t>
+      </w:r>
+      <w:proofErr w:type="spellStart"/>
+      <w:r>
+        <w:rPr>
+          <w:rFonts w:ascii="Times New Roman" w:eastAsia="Times New Roman" w:hAnsi="Times New Roman" w:cs="Times New Roman"/>
+          <w:sz w:val="20"/>
+        </w:rPr>
+        <w:t>constraint</w:t>
+      </w:r>
+      <w:proofErr w:type="spellEnd"/>
+      <w:r>
+        <w:rPr>
+          <w:rFonts w:ascii="Times New Roman" w:eastAsia="Times New Roman" w:hAnsi="Times New Roman" w:cs="Times New Roman"/>
+          <w:sz w:val="20"/>
+        </w:rPr>
+        <w:t xml:space="preserve"> </w:t>
+      </w:r>
+      <w:proofErr w:type="spellStart"/>
+      <w:r>
+        <w:rPr>
+          <w:rFonts w:ascii="Times New Roman" w:eastAsia="Times New Roman" w:hAnsi="Times New Roman" w:cs="Times New Roman"/>
+          <w:sz w:val="20"/>
+        </w:rPr>
+        <w:t>equations</w:t>
+      </w:r>
+      <w:proofErr w:type="spellEnd"/>
+      <w:r>
+        <w:rPr>
+          <w:rFonts w:ascii="Times New Roman" w:eastAsia="Times New Roman" w:hAnsi="Times New Roman" w:cs="Times New Roman"/>
+          <w:sz w:val="20"/>
+        </w:rPr>
+        <w:t xml:space="preserve">, </w:t>
+      </w:r>
+      <w:proofErr w:type="spellStart"/>
+      <w:r>
+        <w:rPr>
+          <w:rFonts w:ascii="Times New Roman" w:eastAsia="Times New Roman" w:hAnsi="Times New Roman" w:cs="Times New Roman"/>
+          <w:sz w:val="20"/>
+        </w:rPr>
+        <w:t>damping</w:t>
       </w:r>
       <w:proofErr w:type="spellEnd"/>
       <w:r>
@@ -2155,7 +2670,6 @@
         <w:jc w:val="both"/>
         <w:rPr>
           <w:rFonts w:ascii="Times New Roman" w:eastAsia="Times New Roman" w:hAnsi="Times New Roman" w:cs="Times New Roman"/>
-          <w:lang w:val="en-US"/>
         </w:rPr>
       </w:pPr>
       <w:r>
@@ -2253,7 +2767,7 @@
         </m:sSub>
         <m:r>
           <w:rPr>
-            <w:rFonts w:ascii="Cambria Math" w:eastAsia="Times New Roman" w:hAnsi="Times New Roman" w:cs="Times New Roman"/>
+            <w:rFonts w:ascii="Cambria Math" w:eastAsia="Times New Roman" w:hAnsi="Cambria Math" w:cs="Times New Roman"/>
           </w:rPr>
           <m:t xml:space="preserve"> </m:t>
         </m:r>
@@ -2262,7 +2776,13 @@
         <w:rPr>
           <w:rFonts w:ascii="Times New Roman" w:eastAsia="Times New Roman" w:hAnsi="Times New Roman" w:cs="Times New Roman"/>
         </w:rPr>
-        <w:t>що з’єднаних невагомою ниткою через блок, розраховується за формулою:</w:t>
+        <w:t>що з’єднані невагомою ниткою через блок, розраховується за формулою</w:t>
+      </w:r>
+      <w:r>
+        <w:rPr>
+          <w:rFonts w:ascii="Times New Roman" w:eastAsia="Times New Roman" w:hAnsi="Times New Roman" w:cs="Times New Roman"/>
+        </w:rPr>
+        <w:t>:</w:t>
       </w:r>
     </w:p>
     <w:p>
@@ -2282,6 +2802,7 @@
               <w:rFonts w:ascii="Cambria Math" w:eastAsia="Times New Roman" w:hAnsi="Cambria Math" w:cs="Times New Roman"/>
               <w:lang w:val="en-US"/>
             </w:rPr>
+            <w:lastRenderedPageBreak/>
             <m:t>a=g·</m:t>
           </m:r>
           <m:f>
@@ -2440,120 +2961,28 @@
         <w:rPr>
           <w:rFonts w:ascii="Times New Roman" w:eastAsia="Times New Roman" w:hAnsi="Times New Roman" w:cs="Times New Roman"/>
         </w:rPr>
-        <w:lastRenderedPageBreak/>
-        <w:t xml:space="preserve">При реалізації даної моделі в ігрових рушіях, таких як </w:t>
-      </w:r>
-      <w:proofErr w:type="spellStart"/>
-      <w:r>
-        <w:rPr>
-          <w:rFonts w:ascii="Times New Roman" w:eastAsia="Times New Roman" w:hAnsi="Times New Roman" w:cs="Times New Roman"/>
-        </w:rPr>
-        <w:t>Unity</w:t>
-      </w:r>
-      <w:proofErr w:type="spellEnd"/>
-      <w:r>
-        <w:rPr>
-          <w:rFonts w:ascii="Times New Roman" w:eastAsia="Times New Roman" w:hAnsi="Times New Roman" w:cs="Times New Roman"/>
-        </w:rPr>
-        <w:t xml:space="preserve"> (</w:t>
-      </w:r>
-      <w:proofErr w:type="spellStart"/>
-      <w:r>
-        <w:rPr>
-          <w:rFonts w:ascii="Times New Roman" w:eastAsia="Times New Roman" w:hAnsi="Times New Roman" w:cs="Times New Roman"/>
-        </w:rPr>
-        <w:t>PhysX</w:t>
-      </w:r>
-      <w:proofErr w:type="spellEnd"/>
-      <w:r>
-        <w:rPr>
-          <w:rFonts w:ascii="Times New Roman" w:eastAsia="Times New Roman" w:hAnsi="Times New Roman" w:cs="Times New Roman"/>
-        </w:rPr>
-        <w:t xml:space="preserve">) або </w:t>
-      </w:r>
-      <w:proofErr w:type="spellStart"/>
-      <w:r>
-        <w:rPr>
-          <w:rFonts w:ascii="Times New Roman" w:eastAsia="Times New Roman" w:hAnsi="Times New Roman" w:cs="Times New Roman"/>
-        </w:rPr>
-        <w:t>Unreal</w:t>
-      </w:r>
-      <w:proofErr w:type="spellEnd"/>
-      <w:r>
-        <w:rPr>
-          <w:rFonts w:ascii="Times New Roman" w:eastAsia="Times New Roman" w:hAnsi="Times New Roman" w:cs="Times New Roman"/>
-        </w:rPr>
-        <w:t xml:space="preserve"> </w:t>
-      </w:r>
-      <w:proofErr w:type="spellStart"/>
-      <w:r>
-        <w:rPr>
-          <w:rFonts w:ascii="Times New Roman" w:eastAsia="Times New Roman" w:hAnsi="Times New Roman" w:cs="Times New Roman"/>
-        </w:rPr>
-        <w:t>Engine</w:t>
-      </w:r>
-      <w:proofErr w:type="spellEnd"/>
-      <w:r>
-        <w:rPr>
-          <w:rFonts w:ascii="Times New Roman" w:eastAsia="Times New Roman" w:hAnsi="Times New Roman" w:cs="Times New Roman"/>
-        </w:rPr>
-        <w:t xml:space="preserve"> (</w:t>
-      </w:r>
-      <w:proofErr w:type="spellStart"/>
-      <w:r>
-        <w:rPr>
-          <w:rFonts w:ascii="Times New Roman" w:eastAsia="Times New Roman" w:hAnsi="Times New Roman" w:cs="Times New Roman"/>
-        </w:rPr>
-        <w:t>Chaos</w:t>
-      </w:r>
-      <w:proofErr w:type="spellEnd"/>
-      <w:r>
-        <w:rPr>
-          <w:rFonts w:ascii="Times New Roman" w:eastAsia="Times New Roman" w:hAnsi="Times New Roman" w:cs="Times New Roman"/>
-        </w:rPr>
-        <w:t xml:space="preserve">), виникають специфічні обчислювальні виклики. На відміну від аналітичних </w:t>
-      </w:r>
-      <w:proofErr w:type="spellStart"/>
-      <w:r>
-        <w:rPr>
-          <w:rFonts w:ascii="Times New Roman" w:eastAsia="Times New Roman" w:hAnsi="Times New Roman" w:cs="Times New Roman"/>
-        </w:rPr>
-        <w:t>розв’язків</w:t>
-      </w:r>
-      <w:proofErr w:type="spellEnd"/>
-      <w:r>
-        <w:rPr>
-          <w:rFonts w:ascii="Times New Roman" w:eastAsia="Times New Roman" w:hAnsi="Times New Roman" w:cs="Times New Roman"/>
-        </w:rPr>
-        <w:t xml:space="preserve">, ігрові симуляції працюють у дискретному часі, що призводить до накопичення похибок при великих кроках інтегрування. Для забезпечення стабільності систем із тросами у стратегіях часто використовують інтегрування </w:t>
-      </w:r>
-      <w:proofErr w:type="spellStart"/>
-      <w:r>
-        <w:rPr>
-          <w:rFonts w:ascii="Times New Roman" w:eastAsia="Times New Roman" w:hAnsi="Times New Roman" w:cs="Times New Roman"/>
-        </w:rPr>
-        <w:t>Верле</w:t>
-      </w:r>
-      <w:proofErr w:type="spellEnd"/>
-      <w:r>
-        <w:rPr>
-          <w:rFonts w:ascii="Times New Roman" w:eastAsia="Times New Roman" w:hAnsi="Times New Roman" w:cs="Times New Roman"/>
-        </w:rPr>
-        <w:t xml:space="preserve">. Даний алгоритм базується на зміні координат, а не швидкостей, що робить систему стійкою до різких імпульсів та запобігає розривам віртуальних </w:t>
-      </w:r>
-      <w:proofErr w:type="spellStart"/>
-      <w:r>
-        <w:rPr>
-          <w:rFonts w:ascii="Times New Roman" w:eastAsia="Times New Roman" w:hAnsi="Times New Roman" w:cs="Times New Roman"/>
-        </w:rPr>
-        <w:t>зв’язків</w:t>
-      </w:r>
-      <w:proofErr w:type="spellEnd"/>
-      <w:r>
-        <w:rPr>
-          <w:rFonts w:ascii="Times New Roman" w:eastAsia="Times New Roman" w:hAnsi="Times New Roman" w:cs="Times New Roman"/>
-        </w:rPr>
-        <w:t xml:space="preserve"> [2]:</w:t>
+        <w:t xml:space="preserve">Для повноцінного перенесення цієї моделі у віртуальне середовище, особливо для облогових знарядь, недостатньо лише розрахунку кінематики. Критично важливо визначити силу натягу нитки </w:t>
+      </w:r>
+      <m:oMath>
+        <m:r>
+          <w:rPr>
+            <w:rFonts w:ascii="Cambria Math" w:eastAsia="Times New Roman" w:hAnsi="Cambria Math" w:cs="Times New Roman"/>
+          </w:rPr>
+          <m:t>T</m:t>
+        </m:r>
+      </m:oMath>
+      <w:r>
+        <w:rPr>
+          <w:rFonts w:ascii="Times New Roman" w:eastAsia="Times New Roman" w:hAnsi="Times New Roman" w:cs="Times New Roman"/>
+        </w:rPr>
+        <w:t>, яка передає навантаження на опори конструкції та дозволяє рушію імітувати руйнування від перенавантажень</w:t>
+      </w:r>
+      <w:r>
+        <w:rPr>
+          <w:rFonts w:ascii="Times New Roman" w:eastAsia="Times New Roman" w:hAnsi="Times New Roman" w:cs="Times New Roman"/>
+          <w:lang w:val="en-US"/>
+        </w:rPr>
+        <w:t>:</w:t>
       </w:r>
     </w:p>
     <w:p>
@@ -2567,108 +2996,26 @@
       </w:pPr>
       <m:oMathPara>
         <m:oMath>
-          <m:sSub>
-            <m:sSubPr>
+          <m:r>
+            <w:rPr>
+              <w:rFonts w:ascii="Cambria Math" w:eastAsia="Times New Roman" w:hAnsi="Cambria Math" w:cs="Times New Roman"/>
+            </w:rPr>
+            <m:t>T=</m:t>
+          </m:r>
+          <m:f>
+            <m:fPr>
               <m:ctrlPr>
                 <w:rPr>
                   <w:rFonts w:ascii="Cambria Math" w:eastAsia="Times New Roman" w:hAnsi="Cambria Math" w:cs="Times New Roman"/>
                 </w:rPr>
               </m:ctrlPr>
-            </m:sSubPr>
-            <m:e>
+            </m:fPr>
+            <m:num>
               <m:r>
                 <w:rPr>
                   <w:rFonts w:ascii="Cambria Math" w:eastAsia="Times New Roman" w:hAnsi="Cambria Math" w:cs="Times New Roman"/>
                 </w:rPr>
-                <m:t>x</m:t>
-              </m:r>
-            </m:e>
-            <m:sub>
-              <m:r>
-                <w:rPr>
-                  <w:rFonts w:ascii="Cambria Math" w:eastAsia="Times New Roman" w:hAnsi="Cambria Math" w:cs="Times New Roman"/>
-                </w:rPr>
-                <m:t>n+1</m:t>
-              </m:r>
-            </m:sub>
-          </m:sSub>
-          <m:r>
-            <w:rPr>
-              <w:rFonts w:ascii="Cambria Math" w:eastAsia="Times New Roman" w:hAnsi="Cambria Math" w:cs="Times New Roman"/>
-            </w:rPr>
-            <m:t>=</m:t>
-          </m:r>
-          <m:sSub>
-            <m:sSubPr>
-              <m:ctrlPr>
-                <w:rPr>
-                  <w:rFonts w:ascii="Cambria Math" w:eastAsia="Times New Roman" w:hAnsi="Cambria Math" w:cs="Times New Roman"/>
-                </w:rPr>
-              </m:ctrlPr>
-            </m:sSubPr>
-            <m:e>
-              <m:r>
-                <w:rPr>
-                  <w:rFonts w:ascii="Cambria Math" w:eastAsia="Times New Roman" w:hAnsi="Cambria Math" w:cs="Times New Roman"/>
-                </w:rPr>
-                <m:t>x</m:t>
-              </m:r>
-            </m:e>
-            <m:sub>
-              <m:r>
-                <w:rPr>
-                  <w:rFonts w:ascii="Cambria Math" w:eastAsia="Times New Roman" w:hAnsi="Cambria Math" w:cs="Times New Roman"/>
-                </w:rPr>
-                <m:t>n</m:t>
-              </m:r>
-            </m:sub>
-          </m:sSub>
-          <m:r>
-            <w:rPr>
-              <w:rFonts w:ascii="Cambria Math" w:eastAsia="Times New Roman" w:hAnsi="Cambria Math" w:cs="Times New Roman"/>
-            </w:rPr>
-            <m:t>+</m:t>
-          </m:r>
-          <m:d>
-            <m:dPr>
-              <m:ctrlPr>
-                <w:rPr>
-                  <w:rFonts w:ascii="Cambria Math" w:eastAsia="Times New Roman" w:hAnsi="Cambria Math" w:cs="Times New Roman"/>
-                  <w:i/>
-                </w:rPr>
-              </m:ctrlPr>
-            </m:dPr>
-            <m:e>
-              <m:sSub>
-                <m:sSubPr>
-                  <m:ctrlPr>
-                    <w:rPr>
-                      <w:rFonts w:ascii="Cambria Math" w:eastAsia="Times New Roman" w:hAnsi="Cambria Math" w:cs="Times New Roman"/>
-                    </w:rPr>
-                  </m:ctrlPr>
-                </m:sSubPr>
-                <m:e>
-                  <m:r>
-                    <w:rPr>
-                      <w:rFonts w:ascii="Cambria Math" w:eastAsia="Times New Roman" w:hAnsi="Cambria Math" w:cs="Times New Roman"/>
-                    </w:rPr>
-                    <m:t>x</m:t>
-                  </m:r>
-                </m:e>
-                <m:sub>
-                  <m:r>
-                    <w:rPr>
-                      <w:rFonts w:ascii="Cambria Math" w:eastAsia="Times New Roman" w:hAnsi="Cambria Math" w:cs="Times New Roman"/>
-                    </w:rPr>
-                    <m:t>n</m:t>
-                  </m:r>
-                </m:sub>
-              </m:sSub>
-              <m:r>
-                <w:rPr>
-                  <w:rFonts w:ascii="Cambria Math" w:eastAsia="Times New Roman" w:hAnsi="Cambria Math" w:cs="Times New Roman"/>
-                </w:rPr>
-                <m:t>-</m:t>
+                <m:t>2</m:t>
               </m:r>
               <m:sSub>
                 <m:sSubPr>
@@ -2683,6 +3030,356 @@
                     <w:rPr>
                       <w:rFonts w:ascii="Cambria Math" w:eastAsia="Times New Roman" w:hAnsi="Cambria Math" w:cs="Times New Roman"/>
                     </w:rPr>
+                    <m:t>m</m:t>
+                  </m:r>
+                </m:e>
+                <m:sub>
+                  <m:r>
+                    <w:rPr>
+                      <w:rFonts w:ascii="Cambria Math" w:eastAsia="Times New Roman" w:hAnsi="Cambria Math" w:cs="Times New Roman"/>
+                    </w:rPr>
+                    <m:t>1</m:t>
+                  </m:r>
+                </m:sub>
+              </m:sSub>
+              <m:sSub>
+                <m:sSubPr>
+                  <m:ctrlPr>
+                    <w:rPr>
+                      <w:rFonts w:ascii="Cambria Math" w:eastAsia="Times New Roman" w:hAnsi="Cambria Math" w:cs="Times New Roman"/>
+                    </w:rPr>
+                  </m:ctrlPr>
+                </m:sSubPr>
+                <m:e>
+                  <m:r>
+                    <w:rPr>
+                      <w:rFonts w:ascii="Cambria Math" w:eastAsia="Times New Roman" w:hAnsi="Cambria Math" w:cs="Times New Roman"/>
+                    </w:rPr>
+                    <m:t>m</m:t>
+                  </m:r>
+                </m:e>
+                <m:sub>
+                  <m:r>
+                    <w:rPr>
+                      <w:rFonts w:ascii="Cambria Math" w:eastAsia="Times New Roman" w:hAnsi="Cambria Math" w:cs="Times New Roman"/>
+                    </w:rPr>
+                    <m:t>2</m:t>
+                  </m:r>
+                </m:sub>
+              </m:sSub>
+              <m:r>
+                <w:rPr>
+                  <w:rFonts w:ascii="Cambria Math" w:eastAsia="Times New Roman" w:hAnsi="Cambria Math" w:cs="Times New Roman"/>
+                </w:rPr>
+                <m:t>g</m:t>
+              </m:r>
+            </m:num>
+            <m:den>
+              <m:sSub>
+                <m:sSubPr>
+                  <m:ctrlPr>
+                    <w:rPr>
+                      <w:rFonts w:ascii="Cambria Math" w:eastAsia="Times New Roman" w:hAnsi="Cambria Math" w:cs="Times New Roman"/>
+                    </w:rPr>
+                  </m:ctrlPr>
+                </m:sSubPr>
+                <m:e>
+                  <m:r>
+                    <w:rPr>
+                      <w:rFonts w:ascii="Cambria Math" w:eastAsia="Times New Roman" w:hAnsi="Cambria Math" w:cs="Times New Roman"/>
+                    </w:rPr>
+                    <m:t>m</m:t>
+                  </m:r>
+                </m:e>
+                <m:sub>
+                  <m:r>
+                    <w:rPr>
+                      <w:rFonts w:ascii="Cambria Math" w:eastAsia="Times New Roman" w:hAnsi="Cambria Math" w:cs="Times New Roman"/>
+                    </w:rPr>
+                    <m:t>1</m:t>
+                  </m:r>
+                </m:sub>
+              </m:sSub>
+              <m:r>
+                <w:rPr>
+                  <w:rFonts w:ascii="Cambria Math" w:eastAsia="Times New Roman" w:hAnsi="Cambria Math" w:cs="Times New Roman"/>
+                </w:rPr>
+                <m:t>+</m:t>
+              </m:r>
+              <m:sSub>
+                <m:sSubPr>
+                  <m:ctrlPr>
+                    <w:rPr>
+                      <w:rFonts w:ascii="Cambria Math" w:eastAsia="Times New Roman" w:hAnsi="Cambria Math" w:cs="Times New Roman"/>
+                    </w:rPr>
+                  </m:ctrlPr>
+                </m:sSubPr>
+                <m:e>
+                  <m:r>
+                    <w:rPr>
+                      <w:rFonts w:ascii="Cambria Math" w:eastAsia="Times New Roman" w:hAnsi="Cambria Math" w:cs="Times New Roman"/>
+                    </w:rPr>
+                    <m:t>m</m:t>
+                  </m:r>
+                </m:e>
+                <m:sub>
+                  <m:r>
+                    <w:rPr>
+                      <w:rFonts w:ascii="Cambria Math" w:eastAsia="Times New Roman" w:hAnsi="Cambria Math" w:cs="Times New Roman"/>
+                    </w:rPr>
+                    <m:t>2</m:t>
+                  </m:r>
+                </m:sub>
+              </m:sSub>
+            </m:den>
+          </m:f>
+        </m:oMath>
+      </m:oMathPara>
+    </w:p>
+    <w:p>
+      <w:pPr>
+        <w:spacing w:after="471" w:line="240" w:lineRule="auto"/>
+        <w:ind w:firstLine="284"/>
+        <w:jc w:val="both"/>
+        <w:rPr>
+          <w:rFonts w:ascii="Times New Roman" w:eastAsia="Times New Roman" w:hAnsi="Times New Roman" w:cs="Times New Roman"/>
+          <w:lang w:val="en-US"/>
+        </w:rPr>
+      </w:pPr>
+      <w:r>
+        <w:rPr>
+          <w:rFonts w:ascii="Times New Roman" w:eastAsia="Times New Roman" w:hAnsi="Times New Roman" w:cs="Times New Roman"/>
+        </w:rPr>
+        <w:t xml:space="preserve">При реалізації даної моделі в ігрових рушіях, таких як </w:t>
+      </w:r>
+      <w:proofErr w:type="spellStart"/>
+      <w:r>
+        <w:rPr>
+          <w:rFonts w:ascii="Times New Roman" w:eastAsia="Times New Roman" w:hAnsi="Times New Roman" w:cs="Times New Roman"/>
+        </w:rPr>
+        <w:t>Unity</w:t>
+      </w:r>
+      <w:proofErr w:type="spellEnd"/>
+      <w:r>
+        <w:rPr>
+          <w:rFonts w:ascii="Times New Roman" w:eastAsia="Times New Roman" w:hAnsi="Times New Roman" w:cs="Times New Roman"/>
+        </w:rPr>
+        <w:t xml:space="preserve"> (</w:t>
+      </w:r>
+      <w:proofErr w:type="spellStart"/>
+      <w:r>
+        <w:rPr>
+          <w:rFonts w:ascii="Times New Roman" w:eastAsia="Times New Roman" w:hAnsi="Times New Roman" w:cs="Times New Roman"/>
+        </w:rPr>
+        <w:t>PhysX</w:t>
+      </w:r>
+      <w:proofErr w:type="spellEnd"/>
+      <w:r>
+        <w:rPr>
+          <w:rFonts w:ascii="Times New Roman" w:eastAsia="Times New Roman" w:hAnsi="Times New Roman" w:cs="Times New Roman"/>
+        </w:rPr>
+        <w:t xml:space="preserve">) або </w:t>
+      </w:r>
+      <w:proofErr w:type="spellStart"/>
+      <w:r>
+        <w:rPr>
+          <w:rFonts w:ascii="Times New Roman" w:eastAsia="Times New Roman" w:hAnsi="Times New Roman" w:cs="Times New Roman"/>
+        </w:rPr>
+        <w:t>Unreal</w:t>
+      </w:r>
+      <w:proofErr w:type="spellEnd"/>
+      <w:r>
+        <w:rPr>
+          <w:rFonts w:ascii="Times New Roman" w:eastAsia="Times New Roman" w:hAnsi="Times New Roman" w:cs="Times New Roman"/>
+        </w:rPr>
+        <w:t xml:space="preserve"> </w:t>
+      </w:r>
+      <w:proofErr w:type="spellStart"/>
+      <w:r>
+        <w:rPr>
+          <w:rFonts w:ascii="Times New Roman" w:eastAsia="Times New Roman" w:hAnsi="Times New Roman" w:cs="Times New Roman"/>
+        </w:rPr>
+        <w:t>Engine</w:t>
+      </w:r>
+      <w:proofErr w:type="spellEnd"/>
+      <w:r>
+        <w:rPr>
+          <w:rFonts w:ascii="Times New Roman" w:eastAsia="Times New Roman" w:hAnsi="Times New Roman" w:cs="Times New Roman"/>
+        </w:rPr>
+        <w:t xml:space="preserve"> (</w:t>
+      </w:r>
+      <w:proofErr w:type="spellStart"/>
+      <w:r>
+        <w:rPr>
+          <w:rFonts w:ascii="Times New Roman" w:eastAsia="Times New Roman" w:hAnsi="Times New Roman" w:cs="Times New Roman"/>
+        </w:rPr>
+        <w:t>Chaos</w:t>
+      </w:r>
+      <w:proofErr w:type="spellEnd"/>
+      <w:r>
+        <w:rPr>
+          <w:rFonts w:ascii="Times New Roman" w:eastAsia="Times New Roman" w:hAnsi="Times New Roman" w:cs="Times New Roman"/>
+        </w:rPr>
+        <w:t xml:space="preserve">), виникають специфічні обчислювальні виклики. На відміну від аналітичних </w:t>
+      </w:r>
+      <w:proofErr w:type="spellStart"/>
+      <w:r>
+        <w:rPr>
+          <w:rFonts w:ascii="Times New Roman" w:eastAsia="Times New Roman" w:hAnsi="Times New Roman" w:cs="Times New Roman"/>
+        </w:rPr>
+        <w:t>розв’язків</w:t>
+      </w:r>
+      <w:proofErr w:type="spellEnd"/>
+      <w:r>
+        <w:rPr>
+          <w:rFonts w:ascii="Times New Roman" w:eastAsia="Times New Roman" w:hAnsi="Times New Roman" w:cs="Times New Roman"/>
+        </w:rPr>
+        <w:t xml:space="preserve">, ігрові симуляції працюють у дискретному часі, що призводить до накопичення похибок при великих кроках інтегрування. Для забезпечення стабільності систем із тросами у стратегіях часто використовують інтегрування </w:t>
+      </w:r>
+      <w:proofErr w:type="spellStart"/>
+      <w:r>
+        <w:rPr>
+          <w:rFonts w:ascii="Times New Roman" w:eastAsia="Times New Roman" w:hAnsi="Times New Roman" w:cs="Times New Roman"/>
+        </w:rPr>
+        <w:t>Верле</w:t>
+      </w:r>
+      <w:proofErr w:type="spellEnd"/>
+      <w:r>
+        <w:rPr>
+          <w:rFonts w:ascii="Times New Roman" w:eastAsia="Times New Roman" w:hAnsi="Times New Roman" w:cs="Times New Roman"/>
+        </w:rPr>
+        <w:t xml:space="preserve">. Даний алгоритм базується на зміні координат, а не швидкостей, що робить систему стійкою до різких імпульсів та запобігає розривам віртуальних </w:t>
+      </w:r>
+      <w:proofErr w:type="spellStart"/>
+      <w:r>
+        <w:rPr>
+          <w:rFonts w:ascii="Times New Roman" w:eastAsia="Times New Roman" w:hAnsi="Times New Roman" w:cs="Times New Roman"/>
+        </w:rPr>
+        <w:t>зв’язків</w:t>
+      </w:r>
+      <w:proofErr w:type="spellEnd"/>
+      <w:r>
+        <w:rPr>
+          <w:rFonts w:ascii="Times New Roman" w:eastAsia="Times New Roman" w:hAnsi="Times New Roman" w:cs="Times New Roman"/>
+        </w:rPr>
+        <w:t xml:space="preserve"> [2]</w:t>
+      </w:r>
+      <w:r>
+        <w:rPr>
+          <w:rFonts w:ascii="Times New Roman" w:eastAsia="Times New Roman" w:hAnsi="Times New Roman" w:cs="Times New Roman"/>
+          <w:lang w:val="en-US"/>
+        </w:rPr>
+        <w:t>:</w:t>
+      </w:r>
+    </w:p>
+    <w:p>
+      <w:pPr>
+        <w:spacing w:after="471" w:line="240" w:lineRule="auto"/>
+        <w:ind w:firstLine="284"/>
+        <w:jc w:val="both"/>
+        <w:rPr>
+          <w:rFonts w:ascii="Times New Roman" w:eastAsia="Times New Roman" w:hAnsi="Times New Roman" w:cs="Times New Roman"/>
+          <w:lang w:val="en-US"/>
+        </w:rPr>
+      </w:pPr>
+      <m:oMathPara>
+        <m:oMath>
+          <m:sSub>
+            <m:sSubPr>
+              <m:ctrlPr>
+                <w:rPr>
+                  <w:rFonts w:ascii="Cambria Math" w:eastAsia="Times New Roman" w:hAnsi="Cambria Math" w:cs="Times New Roman"/>
+                  <w:lang w:val="en-US"/>
+                </w:rPr>
+              </m:ctrlPr>
+            </m:sSubPr>
+            <m:e>
+              <m:r>
+                <w:rPr>
+                  <w:rFonts w:ascii="Cambria Math" w:eastAsia="Times New Roman" w:hAnsi="Cambria Math" w:cs="Times New Roman"/>
+                  <w:lang w:val="en-US"/>
+                </w:rPr>
+                <m:t>x</m:t>
+              </m:r>
+            </m:e>
+            <m:sub>
+              <m:r>
+                <w:rPr>
+                  <w:rFonts w:ascii="Cambria Math" w:eastAsia="Times New Roman" w:hAnsi="Cambria Math" w:cs="Times New Roman"/>
+                  <w:lang w:val="en-US"/>
+                </w:rPr>
+                <m:t>n+1</m:t>
+              </m:r>
+            </m:sub>
+          </m:sSub>
+          <m:r>
+            <w:rPr>
+              <w:rFonts w:ascii="Cambria Math" w:eastAsia="Times New Roman" w:hAnsi="Cambria Math" w:cs="Times New Roman"/>
+              <w:lang w:val="en-US"/>
+            </w:rPr>
+            <m:t>=</m:t>
+          </m:r>
+          <m:sSub>
+            <m:sSubPr>
+              <m:ctrlPr>
+                <w:rPr>
+                  <w:rFonts w:ascii="Cambria Math" w:eastAsia="Times New Roman" w:hAnsi="Cambria Math" w:cs="Times New Roman"/>
+                  <w:lang w:val="en-US"/>
+                </w:rPr>
+              </m:ctrlPr>
+            </m:sSubPr>
+            <m:e>
+              <m:r>
+                <w:rPr>
+                  <w:rFonts w:ascii="Cambria Math" w:eastAsia="Times New Roman" w:hAnsi="Cambria Math" w:cs="Times New Roman"/>
+                  <w:lang w:val="en-US"/>
+                </w:rPr>
+                <m:t>x</m:t>
+              </m:r>
+            </m:e>
+            <m:sub>
+              <m:r>
+                <w:rPr>
+                  <w:rFonts w:ascii="Cambria Math" w:eastAsia="Times New Roman" w:hAnsi="Cambria Math" w:cs="Times New Roman"/>
+                  <w:lang w:val="en-US"/>
+                </w:rPr>
+                <m:t>n</m:t>
+              </m:r>
+            </m:sub>
+          </m:sSub>
+          <m:r>
+            <w:rPr>
+              <w:rFonts w:ascii="Cambria Math" w:eastAsia="Times New Roman" w:hAnsi="Cambria Math" w:cs="Times New Roman"/>
+              <w:lang w:val="en-US"/>
+            </w:rPr>
+            <m:t>+</m:t>
+          </m:r>
+          <m:d>
+            <m:dPr>
+              <m:ctrlPr>
+                <w:rPr>
+                  <w:rFonts w:ascii="Cambria Math" w:eastAsia="Times New Roman" w:hAnsi="Cambria Math" w:cs="Times New Roman"/>
+                  <w:i/>
+                  <w:lang w:val="en-US"/>
+                </w:rPr>
+              </m:ctrlPr>
+            </m:dPr>
+            <m:e>
+              <m:sSub>
+                <m:sSubPr>
+                  <m:ctrlPr>
+                    <w:rPr>
+                      <w:rFonts w:ascii="Cambria Math" w:eastAsia="Times New Roman" w:hAnsi="Cambria Math" w:cs="Times New Roman"/>
+                      <w:lang w:val="en-US"/>
+                    </w:rPr>
+                  </m:ctrlPr>
+                </m:sSubPr>
+                <m:e>
+                  <m:r>
+                    <w:rPr>
+                      <w:rFonts w:ascii="Cambria Math" w:eastAsia="Times New Roman" w:hAnsi="Cambria Math" w:cs="Times New Roman"/>
+                      <w:lang w:val="en-US"/>
+                    </w:rPr>
                     <m:t>x</m:t>
                   </m:r>
                 </m:e>
@@ -2690,6 +3387,42 @@
                   <m:r>
                     <w:rPr>
                       <w:rFonts w:ascii="Cambria Math" w:eastAsia="Times New Roman" w:hAnsi="Cambria Math" w:cs="Times New Roman"/>
+                      <w:lang w:val="en-US"/>
+                    </w:rPr>
+                    <m:t>n</m:t>
+                  </m:r>
+                </m:sub>
+              </m:sSub>
+              <m:r>
+                <w:rPr>
+                  <w:rFonts w:ascii="Cambria Math" w:eastAsia="Times New Roman" w:hAnsi="Cambria Math" w:cs="Times New Roman"/>
+                  <w:lang w:val="en-US"/>
+                </w:rPr>
+                <m:t>-</m:t>
+              </m:r>
+              <m:sSub>
+                <m:sSubPr>
+                  <m:ctrlPr>
+                    <w:rPr>
+                      <w:rFonts w:ascii="Cambria Math" w:eastAsia="Times New Roman" w:hAnsi="Cambria Math" w:cs="Times New Roman"/>
+                      <w:lang w:val="en-US"/>
+                    </w:rPr>
+                  </m:ctrlPr>
+                </m:sSubPr>
+                <m:e>
+                  <m:r>
+                    <w:rPr>
+                      <w:rFonts w:ascii="Cambria Math" w:eastAsia="Times New Roman" w:hAnsi="Cambria Math" w:cs="Times New Roman"/>
+                      <w:lang w:val="en-US"/>
+                    </w:rPr>
+                    <m:t>x</m:t>
+                  </m:r>
+                </m:e>
+                <m:sub>
+                  <m:r>
+                    <w:rPr>
+                      <w:rFonts w:ascii="Cambria Math" w:eastAsia="Times New Roman" w:hAnsi="Cambria Math" w:cs="Times New Roman"/>
+                      <w:lang w:val="en-US"/>
                     </w:rPr>
                     <m:t>n-1</m:t>
                   </m:r>
@@ -2700,8 +3433,298 @@
           <m:r>
             <w:rPr>
               <w:rFonts w:ascii="Cambria Math" w:eastAsia="Times New Roman" w:hAnsi="Cambria Math" w:cs="Times New Roman"/>
+              <w:lang w:val="en-US"/>
             </w:rPr>
-            <m:t>+a·Δt</m:t>
+            <m:t>+aΔ</m:t>
+          </m:r>
+          <m:sSup>
+            <m:sSupPr>
+              <m:ctrlPr>
+                <w:rPr>
+                  <w:rFonts w:ascii="Cambria Math" w:eastAsia="Times New Roman" w:hAnsi="Cambria Math" w:cs="Times New Roman"/>
+                  <w:lang w:val="en-US"/>
+                </w:rPr>
+              </m:ctrlPr>
+            </m:sSupPr>
+            <m:e>
+              <m:r>
+                <w:rPr>
+                  <w:rFonts w:ascii="Cambria Math" w:eastAsia="Times New Roman" w:hAnsi="Cambria Math" w:cs="Times New Roman"/>
+                  <w:lang w:val="en-US"/>
+                </w:rPr>
+                <m:t>t</m:t>
+              </m:r>
+            </m:e>
+            <m:sup>
+              <m:r>
+                <w:rPr>
+                  <w:rFonts w:ascii="Cambria Math" w:eastAsia="Times New Roman" w:hAnsi="Cambria Math" w:cs="Times New Roman"/>
+                  <w:lang w:val="en-US"/>
+                </w:rPr>
+                <m:t>2</m:t>
+              </m:r>
+            </m:sup>
+          </m:sSup>
+        </m:oMath>
+      </m:oMathPara>
+    </w:p>
+    <w:p>
+      <w:pPr>
+        <w:spacing w:after="471" w:line="240" w:lineRule="auto"/>
+        <w:ind w:firstLine="284"/>
+        <w:jc w:val="both"/>
+        <w:rPr>
+          <w:rFonts w:ascii="Times New Roman" w:eastAsia="Times New Roman" w:hAnsi="Times New Roman" w:cs="Times New Roman"/>
+          <w:lang w:val="en-US"/>
+        </w:rPr>
+      </w:pPr>
+      <w:r>
+        <w:rPr>
+          <w:rFonts w:ascii="Times New Roman" w:eastAsia="Times New Roman" w:hAnsi="Times New Roman" w:cs="Times New Roman"/>
+        </w:rPr>
+        <w:t>Важливим аспектом моделювання у стратегіях є масовість сцен. Коли на екрані одночасно взаємодіють десятки механізмів, рушій змушений використовувати спрощені методи вирішення обмежень (</w:t>
+      </w:r>
+      <w:proofErr w:type="spellStart"/>
+      <w:r>
+        <w:rPr>
+          <w:rFonts w:ascii="Times New Roman" w:eastAsia="Times New Roman" w:hAnsi="Times New Roman" w:cs="Times New Roman"/>
+        </w:rPr>
+        <w:t>Constraint</w:t>
+      </w:r>
+      <w:proofErr w:type="spellEnd"/>
+      <w:r>
+        <w:rPr>
+          <w:rFonts w:ascii="Times New Roman" w:eastAsia="Times New Roman" w:hAnsi="Times New Roman" w:cs="Times New Roman"/>
+        </w:rPr>
+        <w:t xml:space="preserve"> </w:t>
+      </w:r>
+      <w:proofErr w:type="spellStart"/>
+      <w:r>
+        <w:rPr>
+          <w:rFonts w:ascii="Times New Roman" w:eastAsia="Times New Roman" w:hAnsi="Times New Roman" w:cs="Times New Roman"/>
+        </w:rPr>
+        <w:t>Solvers</w:t>
+      </w:r>
+      <w:proofErr w:type="spellEnd"/>
+      <w:r>
+        <w:rPr>
+          <w:rFonts w:ascii="Times New Roman" w:eastAsia="Times New Roman" w:hAnsi="Times New Roman" w:cs="Times New Roman"/>
+        </w:rPr>
+        <w:t xml:space="preserve">). Математично ідеальна нерозтяжна нитка довжиною </w:t>
+      </w:r>
+      <m:oMath>
+        <m:r>
+          <w:rPr>
+            <w:rFonts w:ascii="Cambria Math" w:eastAsia="Times New Roman" w:hAnsi="Cambria Math" w:cs="Times New Roman"/>
+          </w:rPr>
+          <m:t>L</m:t>
+        </m:r>
+      </m:oMath>
+      <w:r>
+        <w:rPr>
+          <w:rFonts w:ascii="Times New Roman" w:eastAsia="Times New Roman" w:hAnsi="Times New Roman" w:cs="Times New Roman"/>
+        </w:rPr>
+        <w:t xml:space="preserve"> </w:t>
+      </w:r>
+      <w:r>
+        <w:rPr>
+          <w:rFonts w:ascii="Times New Roman" w:eastAsia="Times New Roman" w:hAnsi="Times New Roman" w:cs="Times New Roman"/>
+        </w:rPr>
+        <w:t xml:space="preserve">описується рівнянням </w:t>
+      </w:r>
+      <w:proofErr w:type="spellStart"/>
+      <w:r>
+        <w:rPr>
+          <w:rFonts w:ascii="Times New Roman" w:eastAsia="Times New Roman" w:hAnsi="Times New Roman" w:cs="Times New Roman"/>
+        </w:rPr>
+        <w:t>голономного</w:t>
+      </w:r>
+      <w:proofErr w:type="spellEnd"/>
+      <w:r>
+        <w:rPr>
+          <w:rFonts w:ascii="Times New Roman" w:eastAsia="Times New Roman" w:hAnsi="Times New Roman" w:cs="Times New Roman"/>
+        </w:rPr>
+        <w:t xml:space="preserve"> зв'язку</w:t>
+      </w:r>
+      <w:r>
+        <w:rPr>
+          <w:rFonts w:ascii="Times New Roman" w:eastAsia="Times New Roman" w:hAnsi="Times New Roman" w:cs="Times New Roman"/>
+          <w:lang w:val="en-US"/>
+        </w:rPr>
+        <w:t>:</w:t>
+      </w:r>
+    </w:p>
+    <w:p>
+      <w:pPr>
+        <w:spacing w:after="471" w:line="240" w:lineRule="auto"/>
+        <w:ind w:firstLine="284"/>
+        <w:jc w:val="both"/>
+        <w:rPr>
+          <w:rFonts w:ascii="Times New Roman" w:eastAsia="Times New Roman" w:hAnsi="Times New Roman" w:cs="Times New Roman"/>
+          <w:lang w:val="en-US"/>
+        </w:rPr>
+      </w:pPr>
+      <m:oMathPara>
+        <m:oMath>
+          <m:r>
+            <w:rPr>
+              <w:rFonts w:ascii="Cambria Math" w:eastAsia="Times New Roman" w:hAnsi="Cambria Math" w:cs="Times New Roman"/>
+              <w:lang w:val="en-US"/>
+            </w:rPr>
+            <m:t>C</m:t>
+          </m:r>
+          <m:d>
+            <m:dPr>
+              <m:ctrlPr>
+                <w:rPr>
+                  <w:rFonts w:ascii="Cambria Math" w:eastAsia="Times New Roman" w:hAnsi="Cambria Math" w:cs="Times New Roman"/>
+                  <w:i/>
+                  <w:lang w:val="en-US"/>
+                </w:rPr>
+              </m:ctrlPr>
+            </m:dPr>
+            <m:e>
+              <m:sSub>
+                <m:sSubPr>
+                  <m:ctrlPr>
+                    <w:rPr>
+                      <w:rFonts w:ascii="Cambria Math" w:eastAsia="Times New Roman" w:hAnsi="Cambria Math" w:cs="Times New Roman"/>
+                      <w:lang w:val="en-US"/>
+                    </w:rPr>
+                  </m:ctrlPr>
+                </m:sSubPr>
+                <m:e>
+                  <m:r>
+                    <w:rPr>
+                      <w:rFonts w:ascii="Cambria Math" w:eastAsia="Times New Roman" w:hAnsi="Cambria Math" w:cs="Times New Roman"/>
+                      <w:lang w:val="en-US"/>
+                    </w:rPr>
+                    <m:t>x</m:t>
+                  </m:r>
+                </m:e>
+                <m:sub>
+                  <m:r>
+                    <w:rPr>
+                      <w:rFonts w:ascii="Cambria Math" w:eastAsia="Times New Roman" w:hAnsi="Cambria Math" w:cs="Times New Roman"/>
+                      <w:lang w:val="en-US"/>
+                    </w:rPr>
+                    <m:t>1</m:t>
+                  </m:r>
+                </m:sub>
+              </m:sSub>
+              <m:r>
+                <w:rPr>
+                  <w:rFonts w:ascii="Cambria Math" w:eastAsia="Times New Roman" w:hAnsi="Cambria Math" w:cs="Times New Roman"/>
+                  <w:lang w:val="en-US"/>
+                </w:rPr>
+                <m:t>,</m:t>
+              </m:r>
+              <m:sSub>
+                <m:sSubPr>
+                  <m:ctrlPr>
+                    <w:rPr>
+                      <w:rFonts w:ascii="Cambria Math" w:eastAsia="Times New Roman" w:hAnsi="Cambria Math" w:cs="Times New Roman"/>
+                      <w:lang w:val="en-US"/>
+                    </w:rPr>
+                  </m:ctrlPr>
+                </m:sSubPr>
+                <m:e>
+                  <m:r>
+                    <w:rPr>
+                      <w:rFonts w:ascii="Cambria Math" w:eastAsia="Times New Roman" w:hAnsi="Cambria Math" w:cs="Times New Roman"/>
+                      <w:lang w:val="en-US"/>
+                    </w:rPr>
+                    <m:t>x</m:t>
+                  </m:r>
+                </m:e>
+                <m:sub>
+                  <m:r>
+                    <w:rPr>
+                      <w:rFonts w:ascii="Cambria Math" w:eastAsia="Times New Roman" w:hAnsi="Cambria Math" w:cs="Times New Roman"/>
+                      <w:lang w:val="en-US"/>
+                    </w:rPr>
+                    <m:t>2</m:t>
+                  </m:r>
+                </m:sub>
+              </m:sSub>
+            </m:e>
+          </m:d>
+          <m:r>
+            <w:rPr>
+              <w:rFonts w:ascii="Cambria Math" w:eastAsia="Times New Roman" w:hAnsi="Cambria Math" w:cs="Times New Roman"/>
+              <w:lang w:val="en-US"/>
+            </w:rPr>
+            <m:t>=</m:t>
+          </m:r>
+          <m:sSub>
+            <m:sSubPr>
+              <m:ctrlPr>
+                <w:rPr>
+                  <w:rFonts w:ascii="Cambria Math" w:eastAsia="Times New Roman" w:hAnsi="Cambria Math" w:cs="Times New Roman"/>
+                  <w:lang w:val="en-US"/>
+                </w:rPr>
+              </m:ctrlPr>
+            </m:sSubPr>
+            <m:e>
+              <m:r>
+                <w:rPr>
+                  <w:rFonts w:ascii="Cambria Math" w:eastAsia="Times New Roman" w:hAnsi="Cambria Math" w:cs="Times New Roman"/>
+                  <w:lang w:val="en-US"/>
+                </w:rPr>
+                <m:t>x</m:t>
+              </m:r>
+            </m:e>
+            <m:sub>
+              <m:r>
+                <w:rPr>
+                  <w:rFonts w:ascii="Cambria Math" w:eastAsia="Times New Roman" w:hAnsi="Cambria Math" w:cs="Times New Roman"/>
+                  <w:lang w:val="en-US"/>
+                </w:rPr>
+                <m:t>1</m:t>
+              </m:r>
+            </m:sub>
+          </m:sSub>
+          <m:r>
+            <w:rPr>
+              <w:rFonts w:ascii="Cambria Math" w:eastAsia="Times New Roman" w:hAnsi="Cambria Math" w:cs="Times New Roman"/>
+              <w:lang w:val="en-US"/>
+            </w:rPr>
+            <m:t>+</m:t>
+          </m:r>
+          <m:sSub>
+            <m:sSubPr>
+              <m:ctrlPr>
+                <w:rPr>
+                  <w:rFonts w:ascii="Cambria Math" w:eastAsia="Times New Roman" w:hAnsi="Cambria Math" w:cs="Times New Roman"/>
+                  <w:lang w:val="en-US"/>
+                </w:rPr>
+              </m:ctrlPr>
+            </m:sSubPr>
+            <m:e>
+              <m:r>
+                <w:rPr>
+                  <w:rFonts w:ascii="Cambria Math" w:eastAsia="Times New Roman" w:hAnsi="Cambria Math" w:cs="Times New Roman"/>
+                  <w:lang w:val="en-US"/>
+                </w:rPr>
+                <m:t>x</m:t>
+              </m:r>
+            </m:e>
+            <m:sub>
+              <m:r>
+                <w:rPr>
+                  <w:rFonts w:ascii="Cambria Math" w:eastAsia="Times New Roman" w:hAnsi="Cambria Math" w:cs="Times New Roman"/>
+                  <w:lang w:val="en-US"/>
+                </w:rPr>
+                <m:t>2</m:t>
+              </m:r>
+            </m:sub>
+          </m:sSub>
+          <m:r>
+            <w:rPr>
+              <w:rFonts w:ascii="Cambria Math" w:eastAsia="Times New Roman" w:hAnsi="Cambria Math" w:cs="Times New Roman"/>
+              <w:lang w:val="en-US"/>
+            </w:rPr>
+            <m:t>-L=0</m:t>
           </m:r>
         </m:oMath>
       </m:oMathPara>
@@ -2713,41 +3736,14 @@
         <w:jc w:val="both"/>
         <w:rPr>
           <w:rFonts w:ascii="Times New Roman" w:eastAsia="Times New Roman" w:hAnsi="Times New Roman" w:cs="Times New Roman"/>
+          <w:lang w:val="en-US"/>
         </w:rPr>
       </w:pPr>
       <w:r>
         <w:rPr>
           <w:rFonts w:ascii="Times New Roman" w:eastAsia="Times New Roman" w:hAnsi="Times New Roman" w:cs="Times New Roman"/>
         </w:rPr>
-        <w:t>Важливим аспектом моделювання у стратегіях є масовість сцен. Коли на екрані одночасно взаємодіють десятки механізмів, рушій змушений використовувати спрощені методи вирішення обмежень (</w:t>
-      </w:r>
-      <w:proofErr w:type="spellStart"/>
-      <w:r>
-        <w:rPr>
-          <w:rFonts w:ascii="Times New Roman" w:eastAsia="Times New Roman" w:hAnsi="Times New Roman" w:cs="Times New Roman"/>
-        </w:rPr>
-        <w:t>Constraint</w:t>
-      </w:r>
-      <w:proofErr w:type="spellEnd"/>
-      <w:r>
-        <w:rPr>
-          <w:rFonts w:ascii="Times New Roman" w:eastAsia="Times New Roman" w:hAnsi="Times New Roman" w:cs="Times New Roman"/>
-        </w:rPr>
-        <w:t xml:space="preserve"> </w:t>
-      </w:r>
-      <w:proofErr w:type="spellStart"/>
-      <w:r>
-        <w:rPr>
-          <w:rFonts w:ascii="Times New Roman" w:eastAsia="Times New Roman" w:hAnsi="Times New Roman" w:cs="Times New Roman"/>
-        </w:rPr>
-        <w:t>Solvers</w:t>
-      </w:r>
-      <w:proofErr w:type="spellEnd"/>
-      <w:r>
-        <w:rPr>
-          <w:rFonts w:ascii="Times New Roman" w:eastAsia="Times New Roman" w:hAnsi="Times New Roman" w:cs="Times New Roman"/>
-        </w:rPr>
-        <w:t xml:space="preserve">). Замість розрахунку точних диференціальних рівнянь, застосовується ітераційний метод </w:t>
+        <w:t xml:space="preserve">Замість розрахунку точних диференціальних рівнянь, застосовується ітераційний метод </w:t>
       </w:r>
       <w:proofErr w:type="spellStart"/>
       <w:r>
@@ -2761,21 +3757,90 @@
         <w:rPr>
           <w:rFonts w:ascii="Times New Roman" w:eastAsia="Times New Roman" w:hAnsi="Times New Roman" w:cs="Times New Roman"/>
         </w:rPr>
-        <w:t xml:space="preserve">, що дозволяє системі «знайти» рівновагу між натягом нитки та гравітацією за фіксовану кількість ітерацій. Це критично для підтримки стабільної частоти кадрів (FPS) при великій кількості </w:t>
-      </w:r>
-      <w:proofErr w:type="spellStart"/>
-      <w:r>
-        <w:rPr>
-          <w:rFonts w:ascii="Times New Roman" w:eastAsia="Times New Roman" w:hAnsi="Times New Roman" w:cs="Times New Roman"/>
-        </w:rPr>
-        <w:t>юнітів</w:t>
-      </w:r>
-      <w:proofErr w:type="spellEnd"/>
-      <w:r>
-        <w:rPr>
-          <w:rFonts w:ascii="Times New Roman" w:eastAsia="Times New Roman" w:hAnsi="Times New Roman" w:cs="Times New Roman"/>
-        </w:rPr>
-        <w:t xml:space="preserve"> [3].</w:t>
+        <w:t xml:space="preserve">, де система послідовно мінімізує значення функції </w:t>
+      </w:r>
+      <m:oMath>
+        <m:r>
+          <w:rPr>
+            <w:rFonts w:ascii="Cambria Math" w:eastAsia="Times New Roman" w:hAnsi="Cambria Math" w:cs="Times New Roman"/>
+          </w:rPr>
+          <m:t>C(</m:t>
+        </m:r>
+        <m:sSub>
+          <m:sSubPr>
+            <m:ctrlPr>
+              <w:rPr>
+                <w:rFonts w:ascii="Cambria Math" w:eastAsia="Times New Roman" w:hAnsi="Cambria Math" w:cs="Times New Roman"/>
+              </w:rPr>
+            </m:ctrlPr>
+          </m:sSubPr>
+          <m:e>
+            <m:r>
+              <w:rPr>
+                <w:rFonts w:ascii="Cambria Math" w:eastAsia="Times New Roman" w:hAnsi="Cambria Math" w:cs="Times New Roman"/>
+              </w:rPr>
+              <m:t>x</m:t>
+            </m:r>
+          </m:e>
+          <m:sub>
+            <m:r>
+              <w:rPr>
+                <w:rFonts w:ascii="Cambria Math" w:eastAsia="Times New Roman" w:hAnsi="Cambria Math" w:cs="Times New Roman"/>
+              </w:rPr>
+              <m:t>1</m:t>
+            </m:r>
+          </m:sub>
+        </m:sSub>
+        <m:r>
+          <w:rPr>
+            <w:rFonts w:ascii="Cambria Math" w:eastAsia="Times New Roman" w:hAnsi="Cambria Math" w:cs="Times New Roman"/>
+          </w:rPr>
+          <m:t>,</m:t>
+        </m:r>
+        <m:sSub>
+          <m:sSubPr>
+            <m:ctrlPr>
+              <w:rPr>
+                <w:rFonts w:ascii="Cambria Math" w:eastAsia="Times New Roman" w:hAnsi="Cambria Math" w:cs="Times New Roman"/>
+              </w:rPr>
+            </m:ctrlPr>
+          </m:sSubPr>
+          <m:e>
+            <m:r>
+              <w:rPr>
+                <w:rFonts w:ascii="Cambria Math" w:eastAsia="Times New Roman" w:hAnsi="Cambria Math" w:cs="Times New Roman"/>
+              </w:rPr>
+              <m:t>x</m:t>
+            </m:r>
+          </m:e>
+          <m:sub>
+            <m:r>
+              <w:rPr>
+                <w:rFonts w:ascii="Cambria Math" w:eastAsia="Times New Roman" w:hAnsi="Cambria Math" w:cs="Times New Roman"/>
+              </w:rPr>
+              <m:t>2</m:t>
+            </m:r>
+          </m:sub>
+        </m:sSub>
+        <m:r>
+          <w:rPr>
+            <w:rFonts w:ascii="Cambria Math" w:eastAsia="Times New Roman" w:hAnsi="Cambria Math" w:cs="Times New Roman"/>
+          </w:rPr>
+          <m:t>)</m:t>
+        </m:r>
+      </m:oMath>
+      <w:r>
+        <w:rPr>
+          <w:rFonts w:ascii="Times New Roman" w:eastAsia="Times New Roman" w:hAnsi="Times New Roman" w:cs="Times New Roman"/>
+        </w:rPr>
+        <w:t>, дозволяючи рушію «знайти» рівновагу між натягом нитки та гравітацією за фіксовану кількість ітерацій [4]. Це критично для підтримки стабільної частоти кадрів (FPS) при великій кількості юнітів [3]</w:t>
+      </w:r>
+      <w:r>
+        <w:rPr>
+          <w:rFonts w:ascii="Times New Roman" w:eastAsia="Times New Roman" w:hAnsi="Times New Roman" w:cs="Times New Roman"/>
+          <w:lang w:val="en-US"/>
+        </w:rPr>
+        <w:t>.</w:t>
       </w:r>
     </w:p>
     <w:p>
@@ -2785,6 +3850,7 @@
         <w:jc w:val="both"/>
         <w:rPr>
           <w:rFonts w:ascii="Times New Roman" w:eastAsia="Times New Roman" w:hAnsi="Times New Roman" w:cs="Times New Roman"/>
+          <w:lang w:val="en-US"/>
         </w:rPr>
       </w:pPr>
       <w:r>
@@ -2819,35 +3885,55 @@
         <w:rPr>
           <w:rFonts w:ascii="Times New Roman" w:eastAsia="Times New Roman" w:hAnsi="Times New Roman" w:cs="Times New Roman"/>
         </w:rPr>
-        <w:t xml:space="preserve"> похибки виникають через масу блока та тертя в осі. В ігровому середовищі ці параметри апроксимуються за допомогою штучного демпфування енергії. Оптимізація розрахунків дозволяє досягти компромісу між фізичною точністю та продуктивністю. Отже, використання математичного апарату машини </w:t>
-      </w:r>
-      <w:proofErr w:type="spellStart"/>
-      <w:r>
-        <w:rPr>
-          <w:rFonts w:ascii="Times New Roman" w:eastAsia="Times New Roman" w:hAnsi="Times New Roman" w:cs="Times New Roman"/>
-        </w:rPr>
-        <w:t>Атвуда</w:t>
-      </w:r>
-      <w:proofErr w:type="spellEnd"/>
-      <w:r>
-        <w:rPr>
-          <w:rFonts w:ascii="Times New Roman" w:eastAsia="Times New Roman" w:hAnsi="Times New Roman" w:cs="Times New Roman"/>
-        </w:rPr>
-        <w:t xml:space="preserve"> у поєднанні з сучасними чисельними методами є ключовим для створення реалістичної фізичної поведінки об’єктів у </w:t>
-      </w:r>
-      <w:proofErr w:type="spellStart"/>
-      <w:r>
-        <w:rPr>
-          <w:rFonts w:ascii="Times New Roman" w:eastAsia="Times New Roman" w:hAnsi="Times New Roman" w:cs="Times New Roman"/>
-        </w:rPr>
-        <w:t>GameDev</w:t>
-      </w:r>
-      <w:proofErr w:type="spellEnd"/>
-      <w:r>
-        <w:rPr>
-          <w:rFonts w:ascii="Times New Roman" w:eastAsia="Times New Roman" w:hAnsi="Times New Roman" w:cs="Times New Roman"/>
-        </w:rPr>
-        <w:t>.</w:t>
+        <w:t xml:space="preserve"> похибки виникають через масу блока та тертя в осі. В ігровому середовищі ці процеси математично апроксимуються за допомогою лінійного або кутового демпфування. Сила опору </w:t>
+      </w:r>
+      <m:oMath>
+        <m:sSub>
+          <m:sSubPr>
+            <m:ctrlPr>
+              <w:rPr>
+                <w:rFonts w:ascii="Cambria Math" w:eastAsia="Times New Roman" w:hAnsi="Cambria Math" w:cs="Times New Roman"/>
+              </w:rPr>
+            </m:ctrlPr>
+          </m:sSubPr>
+          <m:e>
+            <m:r>
+              <w:rPr>
+                <w:rFonts w:ascii="Cambria Math" w:eastAsia="Times New Roman" w:hAnsi="Cambria Math" w:cs="Times New Roman"/>
+              </w:rPr>
+              <m:t>F</m:t>
+            </m:r>
+          </m:e>
+          <m:sub>
+            <m:r>
+              <w:rPr>
+                <w:rFonts w:ascii="Cambria Math" w:eastAsia="Times New Roman" w:hAnsi="Cambria Math" w:cs="Times New Roman"/>
+              </w:rPr>
+              <m:t>drag</m:t>
+            </m:r>
+          </m:sub>
+        </m:sSub>
+      </m:oMath>
+      <w:r>
+        <w:rPr>
+          <w:rFonts w:ascii="Times New Roman" w:eastAsia="Times New Roman" w:hAnsi="Times New Roman" w:cs="Times New Roman"/>
+        </w:rPr>
+        <w:t xml:space="preserve"> вводиться у загальне рівняння руху як величина, пропорційна швидкості </w:t>
+      </w:r>
+      <m:oMath>
+        <m:r>
+          <w:rPr>
+            <w:rFonts w:ascii="Cambria Math" w:eastAsia="Times New Roman" w:hAnsi="Cambria Math" w:cs="Times New Roman"/>
+          </w:rPr>
+          <m:t>v</m:t>
+        </m:r>
+      </m:oMath>
+      <w:r>
+        <w:rPr>
+          <w:rFonts w:ascii="Times New Roman" w:eastAsia="Times New Roman" w:hAnsi="Times New Roman" w:cs="Times New Roman"/>
+          <w:lang w:val="en-US"/>
+        </w:rPr>
+        <w:t>:</w:t>
       </w:r>
     </w:p>
     <w:p>
@@ -2857,6 +3943,193 @@
         <w:jc w:val="both"/>
         <w:rPr>
           <w:rFonts w:ascii="Times New Roman" w:eastAsia="Times New Roman" w:hAnsi="Times New Roman" w:cs="Times New Roman"/>
+          <w:lang w:val="en-US"/>
+        </w:rPr>
+      </w:pPr>
+      <m:oMathPara>
+        <m:oMath>
+          <m:sSub>
+            <m:sSubPr>
+              <m:ctrlPr>
+                <w:rPr>
+                  <w:rFonts w:ascii="Cambria Math" w:eastAsia="Times New Roman" w:hAnsi="Cambria Math" w:cs="Times New Roman"/>
+                  <w:lang w:val="en-US"/>
+                </w:rPr>
+              </m:ctrlPr>
+            </m:sSubPr>
+            <m:e>
+              <m:r>
+                <w:rPr>
+                  <w:rFonts w:ascii="Cambria Math" w:eastAsia="Times New Roman" w:hAnsi="Cambria Math" w:cs="Times New Roman"/>
+                  <w:lang w:val="en-US"/>
+                </w:rPr>
+                <m:t>F</m:t>
+              </m:r>
+            </m:e>
+            <m:sub>
+              <m:r>
+                <w:rPr>
+                  <w:rFonts w:ascii="Cambria Math" w:eastAsia="Times New Roman" w:hAnsi="Cambria Math" w:cs="Times New Roman"/>
+                  <w:lang w:val="en-US"/>
+                </w:rPr>
+                <m:t>drag</m:t>
+              </m:r>
+            </m:sub>
+          </m:sSub>
+          <m:r>
+            <w:rPr>
+              <w:rFonts w:ascii="Cambria Math" w:eastAsia="Times New Roman" w:hAnsi="Cambria Math" w:cs="Times New Roman"/>
+              <w:lang w:val="en-US"/>
+            </w:rPr>
+            <m:t>=-k·v</m:t>
+          </m:r>
+        </m:oMath>
+      </m:oMathPara>
+    </w:p>
+    <w:p>
+      <w:pPr>
+        <w:spacing w:after="471" w:line="240" w:lineRule="auto"/>
+        <w:ind w:firstLine="284"/>
+        <w:jc w:val="both"/>
+        <w:rPr>
+          <w:rFonts w:ascii="Times New Roman" w:eastAsia="Times New Roman" w:hAnsi="Times New Roman" w:cs="Times New Roman"/>
+          <w:lang w:val="en-US"/>
+        </w:rPr>
+      </w:pPr>
+    </w:p>
+    <w:p>
+      <w:pPr>
+        <w:spacing w:after="471" w:line="240" w:lineRule="auto"/>
+        <w:ind w:firstLine="284"/>
+        <w:jc w:val="both"/>
+        <w:rPr>
+          <w:rFonts w:ascii="Times New Roman" w:eastAsia="Times New Roman" w:hAnsi="Times New Roman" w:cs="Times New Roman"/>
+          <w:lang w:val="en-US"/>
+        </w:rPr>
+      </w:pPr>
+    </w:p>
+    <w:p>
+      <w:pPr>
+        <w:spacing w:after="471" w:line="240" w:lineRule="auto"/>
+        <w:ind w:firstLine="284"/>
+        <w:jc w:val="both"/>
+        <w:rPr>
+          <w:rFonts w:ascii="Times New Roman" w:eastAsia="Times New Roman" w:hAnsi="Times New Roman" w:cs="Times New Roman"/>
+          <w:lang w:val="en-US"/>
+        </w:rPr>
+      </w:pPr>
+    </w:p>
+    <w:p>
+      <w:pPr>
+        <w:spacing w:after="471" w:line="240" w:lineRule="auto"/>
+        <w:ind w:firstLine="284"/>
+        <w:jc w:val="both"/>
+        <w:rPr>
+          <w:rFonts w:ascii="Times New Roman" w:eastAsia="Times New Roman" w:hAnsi="Times New Roman" w:cs="Times New Roman"/>
+        </w:rPr>
+      </w:pPr>
+      <w:r>
+        <w:rPr>
+          <w:rFonts w:ascii="Times New Roman" w:eastAsia="Times New Roman" w:hAnsi="Times New Roman" w:cs="Times New Roman"/>
+        </w:rPr>
+        <w:lastRenderedPageBreak/>
+        <w:t xml:space="preserve">де </w:t>
+      </w:r>
+      <m:oMath>
+        <m:r>
+          <w:rPr>
+            <w:rFonts w:ascii="Cambria Math" w:eastAsia="Times New Roman" w:hAnsi="Cambria Math" w:cs="Times New Roman"/>
+          </w:rPr>
+          <m:t>k</m:t>
+        </m:r>
+        <m:r>
+          <w:rPr>
+            <w:rFonts w:ascii="Cambria Math" w:eastAsia="Times New Roman" w:hAnsi="Cambria Math" w:cs="Times New Roman"/>
+          </w:rPr>
+          <m:t xml:space="preserve"> </m:t>
+        </m:r>
+      </m:oMath>
+      <w:r>
+        <w:rPr>
+          <w:rFonts w:ascii="Times New Roman" w:eastAsia="Times New Roman" w:hAnsi="Times New Roman" w:cs="Times New Roman"/>
+          <w:lang w:val="en-US"/>
+        </w:rPr>
+        <w:t>-</w:t>
+      </w:r>
+      <w:r>
+        <w:rPr>
+          <w:rFonts w:ascii="Times New Roman" w:eastAsia="Times New Roman" w:hAnsi="Times New Roman" w:cs="Times New Roman"/>
+        </w:rPr>
+        <w:t xml:space="preserve"> емпіричний коефіцієнт демпфування, який залежить від налаштувань фізичного матеріалу в рушії.</w:t>
+      </w:r>
+    </w:p>
+    <w:p>
+      <w:pPr>
+        <w:spacing w:after="471" w:line="240" w:lineRule="auto"/>
+        <w:ind w:firstLine="284"/>
+        <w:jc w:val="both"/>
+        <w:rPr>
+          <w:rFonts w:ascii="Times New Roman" w:eastAsia="Times New Roman" w:hAnsi="Times New Roman" w:cs="Times New Roman"/>
+          <w:lang w:val="en-US"/>
+        </w:rPr>
+      </w:pPr>
+      <w:r>
+        <w:rPr>
+          <w:rFonts w:ascii="Times New Roman" w:eastAsia="Times New Roman" w:hAnsi="Times New Roman" w:cs="Times New Roman"/>
+        </w:rPr>
+        <w:t xml:space="preserve">Оптимізація розрахунків шляхом застосування інтегрування </w:t>
+      </w:r>
+      <w:proofErr w:type="spellStart"/>
+      <w:r>
+        <w:rPr>
+          <w:rFonts w:ascii="Times New Roman" w:eastAsia="Times New Roman" w:hAnsi="Times New Roman" w:cs="Times New Roman"/>
+        </w:rPr>
+        <w:t>Верле</w:t>
+      </w:r>
+      <w:proofErr w:type="spellEnd"/>
+      <w:r>
+        <w:rPr>
+          <w:rFonts w:ascii="Times New Roman" w:eastAsia="Times New Roman" w:hAnsi="Times New Roman" w:cs="Times New Roman"/>
+        </w:rPr>
+        <w:t xml:space="preserve"> та ітераційного розв'язання обмежень дозволяє досягти компромісу між фізичною точністю та продуктивністю. Отже, використання математичного апарату машини </w:t>
+      </w:r>
+      <w:proofErr w:type="spellStart"/>
+      <w:r>
+        <w:rPr>
+          <w:rFonts w:ascii="Times New Roman" w:eastAsia="Times New Roman" w:hAnsi="Times New Roman" w:cs="Times New Roman"/>
+        </w:rPr>
+        <w:t>Атвуда</w:t>
+      </w:r>
+      <w:proofErr w:type="spellEnd"/>
+      <w:r>
+        <w:rPr>
+          <w:rFonts w:ascii="Times New Roman" w:eastAsia="Times New Roman" w:hAnsi="Times New Roman" w:cs="Times New Roman"/>
+        </w:rPr>
+        <w:t xml:space="preserve"> у поєднанні з сучасними чисельними методами є ключовим для створення реалістичної фізичної поведінки об’єктів у </w:t>
+      </w:r>
+      <w:proofErr w:type="spellStart"/>
+      <w:r>
+        <w:rPr>
+          <w:rFonts w:ascii="Times New Roman" w:eastAsia="Times New Roman" w:hAnsi="Times New Roman" w:cs="Times New Roman"/>
+        </w:rPr>
+        <w:t>GameDev</w:t>
+      </w:r>
+      <w:proofErr w:type="spellEnd"/>
+      <w:r>
+        <w:rPr>
+          <w:rFonts w:ascii="Times New Roman" w:eastAsia="Times New Roman" w:hAnsi="Times New Roman" w:cs="Times New Roman"/>
+        </w:rPr>
+        <w:t>.</w:t>
+      </w:r>
+    </w:p>
+    <w:p>
+      <w:pPr>
+        <w:spacing w:after="471" w:line="240" w:lineRule="auto"/>
+        <w:ind w:firstLine="284"/>
+        <w:jc w:val="both"/>
+        <w:rPr>
+          <w:rFonts w:ascii="Times New Roman" w:eastAsia="Times New Roman" w:hAnsi="Times New Roman" w:cs="Times New Roman"/>
+          <w:lang w:val="en-US"/>
         </w:rPr>
       </w:pPr>
     </w:p>
@@ -2889,7 +4162,7 @@
           <w:ilvl w:val="0"/>
           <w:numId w:val="1"/>
         </w:numPr>
-        <w:spacing w:after="0" w:line="240" w:lineRule="auto"/>
+        <w:spacing w:after="100" w:afterAutospacing="1" w:line="240" w:lineRule="auto"/>
         <w:ind w:left="11" w:hanging="11"/>
       </w:pPr>
       <w:r>
@@ -2954,8 +4227,8 @@
           <w:ilvl w:val="0"/>
           <w:numId w:val="1"/>
         </w:numPr>
-        <w:spacing w:after="252" w:line="240" w:lineRule="auto"/>
-        <w:ind w:left="11" w:hanging="11"/>
+        <w:spacing w:after="100" w:afterAutospacing="1" w:line="240" w:lineRule="auto"/>
+        <w:ind w:left="0" w:firstLine="11"/>
       </w:pPr>
       <w:proofErr w:type="spellStart"/>
       <w:r>
@@ -3076,56 +4349,305 @@
           <w:ilvl w:val="0"/>
           <w:numId w:val="1"/>
         </w:numPr>
-        <w:spacing w:after="252" w:line="240" w:lineRule="auto"/>
+        <w:spacing w:after="100" w:afterAutospacing="1" w:line="240" w:lineRule="auto"/>
+        <w:ind w:left="0" w:firstLine="11"/>
+      </w:pPr>
+      <w:proofErr w:type="spellStart"/>
+      <w:r>
+        <w:rPr>
+          <w:rFonts w:ascii="Times New Roman" w:hAnsi="Times New Roman" w:cs="Times New Roman"/>
+          <w:sz w:val="18"/>
+          <w:szCs w:val="18"/>
+        </w:rPr>
+        <w:t>Eberly</w:t>
+      </w:r>
+      <w:proofErr w:type="spellEnd"/>
+      <w:r>
+        <w:rPr>
+          <w:rFonts w:ascii="Times New Roman" w:hAnsi="Times New Roman" w:cs="Times New Roman"/>
+          <w:sz w:val="18"/>
+          <w:szCs w:val="18"/>
+        </w:rPr>
+        <w:t xml:space="preserve"> D. H. </w:t>
+      </w:r>
+      <w:proofErr w:type="spellStart"/>
+      <w:r>
+        <w:rPr>
+          <w:rFonts w:ascii="Times New Roman" w:hAnsi="Times New Roman" w:cs="Times New Roman"/>
+          <w:sz w:val="18"/>
+          <w:szCs w:val="18"/>
+        </w:rPr>
+        <w:t>Game</w:t>
+      </w:r>
+      <w:proofErr w:type="spellEnd"/>
+      <w:r>
+        <w:rPr>
+          <w:rFonts w:ascii="Times New Roman" w:hAnsi="Times New Roman" w:cs="Times New Roman"/>
+          <w:sz w:val="18"/>
+          <w:szCs w:val="18"/>
+        </w:rPr>
+        <w:t xml:space="preserve"> </w:t>
+      </w:r>
+      <w:proofErr w:type="spellStart"/>
+      <w:r>
+        <w:rPr>
+          <w:rFonts w:ascii="Times New Roman" w:hAnsi="Times New Roman" w:cs="Times New Roman"/>
+          <w:sz w:val="18"/>
+          <w:szCs w:val="18"/>
+        </w:rPr>
+        <w:t>Physics</w:t>
+      </w:r>
+      <w:proofErr w:type="spellEnd"/>
+      <w:r>
+        <w:rPr>
+          <w:rFonts w:ascii="Times New Roman" w:hAnsi="Times New Roman" w:cs="Times New Roman"/>
+          <w:sz w:val="18"/>
+          <w:szCs w:val="18"/>
+        </w:rPr>
+        <w:t xml:space="preserve">. 2nd </w:t>
+      </w:r>
+      <w:proofErr w:type="spellStart"/>
+      <w:r>
+        <w:rPr>
+          <w:rFonts w:ascii="Times New Roman" w:hAnsi="Times New Roman" w:cs="Times New Roman"/>
+          <w:sz w:val="18"/>
+          <w:szCs w:val="18"/>
+        </w:rPr>
+        <w:t>ed</w:t>
+      </w:r>
+      <w:proofErr w:type="spellEnd"/>
+      <w:r>
+        <w:rPr>
+          <w:rFonts w:ascii="Times New Roman" w:hAnsi="Times New Roman" w:cs="Times New Roman"/>
+          <w:sz w:val="18"/>
+          <w:szCs w:val="18"/>
+        </w:rPr>
+        <w:t xml:space="preserve">. </w:t>
+      </w:r>
+      <w:proofErr w:type="spellStart"/>
+      <w:r>
+        <w:rPr>
+          <w:rFonts w:ascii="Times New Roman" w:hAnsi="Times New Roman" w:cs="Times New Roman"/>
+          <w:sz w:val="18"/>
+          <w:szCs w:val="18"/>
+        </w:rPr>
+        <w:t>Morgan</w:t>
+      </w:r>
+      <w:proofErr w:type="spellEnd"/>
+      <w:r>
+        <w:rPr>
+          <w:rFonts w:ascii="Times New Roman" w:hAnsi="Times New Roman" w:cs="Times New Roman"/>
+          <w:sz w:val="18"/>
+          <w:szCs w:val="18"/>
+        </w:rPr>
+        <w:t xml:space="preserve"> </w:t>
+      </w:r>
+      <w:proofErr w:type="spellStart"/>
+      <w:r>
+        <w:rPr>
+          <w:rFonts w:ascii="Times New Roman" w:hAnsi="Times New Roman" w:cs="Times New Roman"/>
+          <w:sz w:val="18"/>
+          <w:szCs w:val="18"/>
+        </w:rPr>
+        <w:t>Kaufmann</w:t>
+      </w:r>
+      <w:proofErr w:type="spellEnd"/>
+      <w:r>
+        <w:rPr>
+          <w:rFonts w:ascii="Times New Roman" w:hAnsi="Times New Roman" w:cs="Times New Roman"/>
+          <w:sz w:val="18"/>
+          <w:szCs w:val="18"/>
+        </w:rPr>
+        <w:t>, 2010. 1064 p</w:t>
+      </w:r>
+      <w:r>
+        <w:t>.</w:t>
+      </w:r>
+    </w:p>
+    <w:p>
+      <w:pPr>
+        <w:numPr>
+          <w:ilvl w:val="0"/>
+          <w:numId w:val="1"/>
+        </w:numPr>
+        <w:spacing w:after="100" w:afterAutospacing="1" w:line="240" w:lineRule="auto"/>
         <w:ind w:left="11" w:hanging="11"/>
+        <w:rPr>
+          <w:rFonts w:ascii="Times New Roman" w:hAnsi="Times New Roman" w:cs="Times New Roman"/>
+          <w:sz w:val="18"/>
+          <w:szCs w:val="18"/>
+        </w:rPr>
       </w:pPr>
       <w:proofErr w:type="spellStart"/>
       <w:r>
-        <w:t>Eberly</w:t>
-      </w:r>
-      <w:proofErr w:type="spellEnd"/>
-      <w:r>
-        <w:t xml:space="preserve"> D. H. </w:t>
-      </w:r>
-      <w:proofErr w:type="spellStart"/>
-      <w:r>
-        <w:t>Game</w:t>
-      </w:r>
-      <w:proofErr w:type="spellEnd"/>
-      <w:r>
-        <w:t xml:space="preserve"> </w:t>
-      </w:r>
-      <w:proofErr w:type="spellStart"/>
-      <w:r>
-        <w:t>Physics</w:t>
-      </w:r>
-      <w:proofErr w:type="spellEnd"/>
-      <w:r>
-        <w:t xml:space="preserve">. 2nd </w:t>
-      </w:r>
-      <w:proofErr w:type="spellStart"/>
-      <w:r>
-        <w:t>ed</w:t>
-      </w:r>
-      <w:proofErr w:type="spellEnd"/>
-      <w:r>
+        <w:rPr>
+          <w:rFonts w:ascii="Times New Roman" w:hAnsi="Times New Roman" w:cs="Times New Roman"/>
+          <w:sz w:val="18"/>
+          <w:szCs w:val="18"/>
+        </w:rPr>
+        <w:t>Erleben</w:t>
+      </w:r>
+      <w:proofErr w:type="spellEnd"/>
+      <w:r>
+        <w:rPr>
+          <w:rFonts w:ascii="Times New Roman" w:hAnsi="Times New Roman" w:cs="Times New Roman"/>
+          <w:sz w:val="18"/>
+          <w:szCs w:val="18"/>
+        </w:rPr>
+        <w:t xml:space="preserve"> K., </w:t>
+      </w:r>
+      <w:proofErr w:type="spellStart"/>
+      <w:r>
+        <w:rPr>
+          <w:rFonts w:ascii="Times New Roman" w:hAnsi="Times New Roman" w:cs="Times New Roman"/>
+          <w:sz w:val="18"/>
+          <w:szCs w:val="18"/>
+        </w:rPr>
+        <w:t>Sporring</w:t>
+      </w:r>
+      <w:proofErr w:type="spellEnd"/>
+      <w:r>
+        <w:rPr>
+          <w:rFonts w:ascii="Times New Roman" w:hAnsi="Times New Roman" w:cs="Times New Roman"/>
+          <w:sz w:val="18"/>
+          <w:szCs w:val="18"/>
+        </w:rPr>
+        <w:t xml:space="preserve"> J., </w:t>
+      </w:r>
+      <w:proofErr w:type="spellStart"/>
+      <w:r>
+        <w:rPr>
+          <w:rFonts w:ascii="Times New Roman" w:hAnsi="Times New Roman" w:cs="Times New Roman"/>
+          <w:sz w:val="18"/>
+          <w:szCs w:val="18"/>
+        </w:rPr>
+        <w:t>Henriksen</w:t>
+      </w:r>
+      <w:proofErr w:type="spellEnd"/>
+      <w:r>
+        <w:rPr>
+          <w:rFonts w:ascii="Times New Roman" w:hAnsi="Times New Roman" w:cs="Times New Roman"/>
+          <w:sz w:val="18"/>
+          <w:szCs w:val="18"/>
+        </w:rPr>
+        <w:t xml:space="preserve"> K., </w:t>
+      </w:r>
+      <w:proofErr w:type="spellStart"/>
+      <w:r>
+        <w:rPr>
+          <w:rFonts w:ascii="Times New Roman" w:hAnsi="Times New Roman" w:cs="Times New Roman"/>
+          <w:sz w:val="18"/>
+          <w:szCs w:val="18"/>
+        </w:rPr>
+        <w:t>Dohlmann</w:t>
+      </w:r>
+      <w:proofErr w:type="spellEnd"/>
+      <w:r>
+        <w:rPr>
+          <w:rFonts w:ascii="Times New Roman" w:hAnsi="Times New Roman" w:cs="Times New Roman"/>
+          <w:sz w:val="18"/>
+          <w:szCs w:val="18"/>
+        </w:rPr>
+        <w:t xml:space="preserve"> H. </w:t>
+      </w:r>
+      <w:proofErr w:type="spellStart"/>
+      <w:r>
+        <w:rPr>
+          <w:rFonts w:ascii="Times New Roman" w:hAnsi="Times New Roman" w:cs="Times New Roman"/>
+          <w:sz w:val="18"/>
+          <w:szCs w:val="18"/>
+        </w:rPr>
+        <w:t>Physics-Based</w:t>
+      </w:r>
+      <w:proofErr w:type="spellEnd"/>
+      <w:r>
+        <w:rPr>
+          <w:rFonts w:ascii="Times New Roman" w:hAnsi="Times New Roman" w:cs="Times New Roman"/>
+          <w:sz w:val="18"/>
+          <w:szCs w:val="18"/>
+        </w:rPr>
+        <w:t xml:space="preserve"> </w:t>
+      </w:r>
+      <w:proofErr w:type="spellStart"/>
+      <w:r>
+        <w:rPr>
+          <w:rFonts w:ascii="Times New Roman" w:hAnsi="Times New Roman" w:cs="Times New Roman"/>
+          <w:sz w:val="18"/>
+          <w:szCs w:val="18"/>
+        </w:rPr>
+        <w:t>Animation</w:t>
+      </w:r>
+      <w:proofErr w:type="spellEnd"/>
+      <w:r>
+        <w:rPr>
+          <w:rFonts w:ascii="Times New Roman" w:hAnsi="Times New Roman" w:cs="Times New Roman"/>
+          <w:sz w:val="18"/>
+          <w:szCs w:val="18"/>
+        </w:rPr>
         <w:t xml:space="preserve">. </w:t>
       </w:r>
       <w:proofErr w:type="spellStart"/>
       <w:r>
-        <w:t>Morgan</w:t>
-      </w:r>
-      <w:proofErr w:type="spellEnd"/>
-      <w:r>
-        <w:t xml:space="preserve"> </w:t>
-      </w:r>
-      <w:proofErr w:type="spellStart"/>
-      <w:r>
-        <w:t>Kaufmann</w:t>
-      </w:r>
-      <w:proofErr w:type="spellEnd"/>
-      <w:r>
-        <w:t>, 2010. 1064 p.</w:t>
+        <w:rPr>
+          <w:rFonts w:ascii="Times New Roman" w:hAnsi="Times New Roman" w:cs="Times New Roman"/>
+          <w:sz w:val="18"/>
+          <w:szCs w:val="18"/>
+        </w:rPr>
+        <w:t>Charles</w:t>
+      </w:r>
+      <w:proofErr w:type="spellEnd"/>
+      <w:r>
+        <w:rPr>
+          <w:rFonts w:ascii="Times New Roman" w:hAnsi="Times New Roman" w:cs="Times New Roman"/>
+          <w:sz w:val="18"/>
+          <w:szCs w:val="18"/>
+        </w:rPr>
+        <w:t xml:space="preserve"> </w:t>
+      </w:r>
+      <w:proofErr w:type="spellStart"/>
+      <w:r>
+        <w:rPr>
+          <w:rFonts w:ascii="Times New Roman" w:hAnsi="Times New Roman" w:cs="Times New Roman"/>
+          <w:sz w:val="18"/>
+          <w:szCs w:val="18"/>
+        </w:rPr>
+        <w:t>River</w:t>
+      </w:r>
+      <w:proofErr w:type="spellEnd"/>
+      <w:r>
+        <w:rPr>
+          <w:rFonts w:ascii="Times New Roman" w:hAnsi="Times New Roman" w:cs="Times New Roman"/>
+          <w:sz w:val="18"/>
+          <w:szCs w:val="18"/>
+        </w:rPr>
+        <w:t xml:space="preserve"> </w:t>
+      </w:r>
+      <w:proofErr w:type="spellStart"/>
+      <w:r>
+        <w:rPr>
+          <w:rFonts w:ascii="Times New Roman" w:hAnsi="Times New Roman" w:cs="Times New Roman"/>
+          <w:sz w:val="18"/>
+          <w:szCs w:val="18"/>
+        </w:rPr>
+        <w:t>Media</w:t>
+      </w:r>
+      <w:proofErr w:type="spellEnd"/>
+      <w:r>
+        <w:rPr>
+          <w:rFonts w:ascii="Times New Roman" w:hAnsi="Times New Roman" w:cs="Times New Roman"/>
+          <w:sz w:val="18"/>
+          <w:szCs w:val="18"/>
+        </w:rPr>
+        <w:t>, 2005. 817 p</w:t>
+      </w:r>
+      <w:r>
+        <w:rPr>
+          <w:rFonts w:ascii="Times New Roman" w:hAnsi="Times New Roman" w:cs="Times New Roman"/>
+          <w:sz w:val="18"/>
+          <w:szCs w:val="18"/>
+          <w:lang w:val="en-US"/>
+        </w:rPr>
+        <w:t>.</w:t>
       </w:r>
     </w:p>
     <w:p>

</xml_diff>